<commit_message>
actividad_2 Unidad2 parte 2
</commit_message>
<xml_diff>
--- a/Actividad 2 Unidad 2 usuarioCOmputadora/Actividad 2 de Usuario COmputadora Unidad 2.docx
+++ b/Actividad 2 Unidad 2 usuarioCOmputadora/Actividad 2 de Usuario COmputadora Unidad 2.docx
@@ -1,6 +1,6 @@
 
 <file path=word/document.xml><?xml version="1.0" encoding="utf-8"?>
-<w:document xmlns:wpc="http://schemas.microsoft.com/office/word/2010/wordprocessingCanvas" xmlns:cx="http://schemas.microsoft.com/office/drawing/2014/chartex" xmlns:cx1="http://schemas.microsoft.com/office/drawing/2015/9/8/chartex" xmlns:cx2="http://schemas.microsoft.com/office/drawing/2015/10/21/chartex" xmlns:cx3="http://schemas.microsoft.com/office/drawing/2016/5/9/chartex" xmlns:cx4="http://schemas.microsoft.com/office/drawing/2016/5/10/chartex" xmlns:cx5="http://schemas.microsoft.com/office/drawing/2016/5/11/chartex" xmlns:cx6="http://schemas.microsoft.com/office/drawing/2016/5/12/chartex" xmlns:cx7="http://schemas.microsoft.com/office/drawing/2016/5/13/chartex" xmlns:cx8="http://schemas.microsoft.com/office/drawing/2016/5/14/chartex" xmlns:mc="http://schemas.openxmlformats.org/markup-compatibility/2006" xmlns:aink="http://schemas.microsoft.com/office/drawing/2016/ink" xmlns:am3d="http://schemas.microsoft.com/office/drawing/2017/model3d" xmlns:o="urn:schemas-microsoft-com:office:office" xmlns:oel="http://schemas.microsoft.com/office/2019/extlst" xmlns:r="http://schemas.openxmlformats.org/officeDocument/2006/relationships" xmlns:m="http://schemas.openxmlformats.org/officeDocument/2006/math" xmlns:v="urn:schemas-microsoft-com:vml" xmlns:wp14="http://schemas.microsoft.com/office/word/2010/wordprocessingDrawing" xmlns:wp="http://schemas.openxmlformats.org/drawingml/2006/wordprocessingDrawing" xmlns:w10="urn:schemas-microsoft-com:office:word" xmlns:w="http://schemas.openxmlformats.org/wordprocessingml/2006/main" xmlns:w14="http://schemas.microsoft.com/office/word/2010/wordml" xmlns:w15="http://schemas.microsoft.com/office/word/2012/wordml" xmlns:w16cex="http://schemas.microsoft.com/office/word/2018/wordml/cex" xmlns:w16cid="http://schemas.microsoft.com/office/word/2016/wordml/cid" xmlns:w16="http://schemas.microsoft.com/office/word/2018/wordml" xmlns:w16du="http://schemas.microsoft.com/office/word/2023/wordml/word16du" xmlns:w16sdtdh="http://schemas.microsoft.com/office/word/2020/wordml/sdtdatahash" xmlns:w16se="http://schemas.microsoft.com/office/word/2015/wordml/symex" xmlns:wpg="http://schemas.microsoft.com/office/word/2010/wordprocessingGroup" xmlns:wpi="http://schemas.microsoft.com/office/word/2010/wordprocessingInk" xmlns:wne="http://schemas.microsoft.com/office/word/2006/wordml" xmlns:wps="http://schemas.microsoft.com/office/word/2010/wordprocessingShape" mc:Ignorable="w14 w15 w16se w16cid w16 w16cex w16sdtdh w16du wp14">
+<w:document xmlns:wpc="http://schemas.microsoft.com/office/word/2010/wordprocessingCanvas" xmlns:cx="http://schemas.microsoft.com/office/drawing/2014/chartex" xmlns:cx1="http://schemas.microsoft.com/office/drawing/2015/9/8/chartex" xmlns:cx2="http://schemas.microsoft.com/office/drawing/2015/10/21/chartex" xmlns:cx3="http://schemas.microsoft.com/office/drawing/2016/5/9/chartex" xmlns:cx4="http://schemas.microsoft.com/office/drawing/2016/5/10/chartex" xmlns:cx5="http://schemas.microsoft.com/office/drawing/2016/5/11/chartex" xmlns:cx6="http://schemas.microsoft.com/office/drawing/2016/5/12/chartex" xmlns:cx7="http://schemas.microsoft.com/office/drawing/2016/5/13/chartex" xmlns:cx8="http://schemas.microsoft.com/office/drawing/2016/5/14/chartex" xmlns:mc="http://schemas.openxmlformats.org/markup-compatibility/2006" xmlns:aink="http://schemas.microsoft.com/office/drawing/2016/ink" xmlns:am3d="http://schemas.microsoft.com/office/drawing/2017/model3d" xmlns:o="urn:schemas-microsoft-com:office:office" xmlns:oel="http://schemas.microsoft.com/office/2019/extlst" xmlns:r="http://schemas.openxmlformats.org/officeDocument/2006/relationships" xmlns:m="http://schemas.openxmlformats.org/officeDocument/2006/math" xmlns:v="urn:schemas-microsoft-com:vml" xmlns:wp14="http://schemas.microsoft.com/office/word/2010/wordprocessingDrawing" xmlns:wp="http://schemas.openxmlformats.org/drawingml/2006/wordprocessingDrawing" xmlns:w10="urn:schemas-microsoft-com:office:word" xmlns:w="http://schemas.openxmlformats.org/wordprocessingml/2006/main" xmlns:w14="http://schemas.microsoft.com/office/word/2010/wordml" xmlns:w15="http://schemas.microsoft.com/office/word/2012/wordml" xmlns:w16cex="http://schemas.microsoft.com/office/word/2018/wordml/cex" xmlns:w16cid="http://schemas.microsoft.com/office/word/2016/wordml/cid" xmlns:w16="http://schemas.microsoft.com/office/word/2018/wordml" xmlns:w16du="http://schemas.microsoft.com/office/word/2023/wordml/word16du" xmlns:w16sdtdh="http://schemas.microsoft.com/office/word/2020/wordml/sdtdatahash" xmlns:w16sdtfl="http://schemas.microsoft.com/office/word/2024/wordml/sdtformatlock" xmlns:w16se="http://schemas.microsoft.com/office/word/2015/wordml/symex" xmlns:wpg="http://schemas.microsoft.com/office/word/2010/wordprocessingGroup" xmlns:wpi="http://schemas.microsoft.com/office/word/2010/wordprocessingInk" xmlns:wne="http://schemas.microsoft.com/office/word/2006/wordml" xmlns:wps="http://schemas.microsoft.com/office/word/2010/wordprocessingShape" mc:Ignorable="w14 w15 w16se w16cid w16 w16cex w16sdtdh w16sdtfl w16du wp14">
   <w:body>
     <w:p>
       <w:pPr>
@@ -9,8 +9,8 @@
         <w:rPr>
           <w:rFonts w:ascii="Arial" w:eastAsia="Times New Roman" w:hAnsi="Arial" w:cs="Arial"/>
           <w:kern w:val="36"/>
-          <w:sz w:val="28"/>
-          <w:szCs w:val="28"/>
+          <w:sz w:val="32"/>
+          <w:szCs w:val="32"/>
           <w:lang w:eastAsia="es-MX"/>
           <w14:ligatures w14:val="none"/>
         </w:rPr>
@@ -19,25 +19,61 @@
         <w:rPr>
           <w:rFonts w:ascii="Arial" w:eastAsia="Times New Roman" w:hAnsi="Arial" w:cs="Arial"/>
           <w:kern w:val="36"/>
-          <w:sz w:val="28"/>
-          <w:szCs w:val="28"/>
-          <w:lang w:eastAsia="es-MX"/>
-          <w14:ligatures w14:val="none"/>
-        </w:rPr>
-        <w:t xml:space="preserve">5IV12   </w:t>
+          <w:sz w:val="32"/>
+          <w:szCs w:val="32"/>
+          <w:lang w:eastAsia="es-MX"/>
+          <w14:ligatures w14:val="none"/>
+        </w:rPr>
+        <w:t xml:space="preserve">5IV12  </w:t>
+      </w:r>
+    </w:p>
+    <w:p>
+      <w:pPr>
+        <w:spacing w:before="100" w:beforeAutospacing="1" w:after="100" w:afterAutospacing="1" w:line="240" w:lineRule="auto"/>
+        <w:outlineLvl w:val="0"/>
+        <w:rPr>
+          <w:rFonts w:ascii="Times New Roman" w:eastAsia="Times New Roman" w:hAnsi="Times New Roman" w:cs="Times New Roman"/>
+          <w:kern w:val="36"/>
+          <w:sz w:val="32"/>
+          <w:szCs w:val="32"/>
+          <w:lang w:eastAsia="es-MX"/>
+          <w14:ligatures w14:val="none"/>
+        </w:rPr>
+      </w:pPr>
+      <w:r>
+        <w:rPr>
+          <w:rFonts w:ascii="Arial" w:eastAsia="Times New Roman" w:hAnsi="Arial" w:cs="Arial"/>
+          <w:kern w:val="36"/>
+          <w:sz w:val="28"/>
+          <w:szCs w:val="28"/>
+          <w:lang w:eastAsia="es-MX"/>
+          <w14:ligatures w14:val="none"/>
+        </w:rPr>
+        <w:t xml:space="preserve"> </w:t>
       </w:r>
       <w:proofErr w:type="spellStart"/>
       <w:proofErr w:type="gramStart"/>
       <w:r>
         <w:rPr>
-          <w:rFonts w:ascii="Arial" w:eastAsia="Times New Roman" w:hAnsi="Arial" w:cs="Arial"/>
+          <w:rFonts w:ascii="Times New Roman" w:eastAsia="Times New Roman" w:hAnsi="Times New Roman" w:cs="Times New Roman"/>
           <w:kern w:val="36"/>
           <w:sz w:val="28"/>
           <w:szCs w:val="28"/>
           <w:lang w:eastAsia="es-MX"/>
           <w14:ligatures w14:val="none"/>
         </w:rPr>
-        <w:t>Nombres:CarranzaMayaEdwinEnrique</w:t>
+        <w:t>Nombres:</w:t>
+      </w:r>
+      <w:r>
+        <w:rPr>
+          <w:rFonts w:ascii="Times New Roman" w:eastAsia="Times New Roman" w:hAnsi="Times New Roman" w:cs="Times New Roman"/>
+          <w:kern w:val="36"/>
+          <w:sz w:val="32"/>
+          <w:szCs w:val="32"/>
+          <w:lang w:eastAsia="es-MX"/>
+          <w14:ligatures w14:val="none"/>
+        </w:rPr>
+        <w:t>CarranzaMayaEdwinEnrique</w:t>
       </w:r>
       <w:proofErr w:type="spellEnd"/>
       <w:proofErr w:type="gramEnd"/>
@@ -47,10 +83,10 @@
         <w:spacing w:before="100" w:beforeAutospacing="1" w:after="100" w:afterAutospacing="1" w:line="240" w:lineRule="auto"/>
         <w:outlineLvl w:val="0"/>
         <w:rPr>
-          <w:rFonts w:ascii="Arial" w:eastAsia="Times New Roman" w:hAnsi="Arial" w:cs="Arial"/>
+          <w:rFonts w:ascii="Times New Roman" w:eastAsia="Times New Roman" w:hAnsi="Times New Roman" w:cs="Times New Roman"/>
           <w:kern w:val="36"/>
-          <w:sz w:val="28"/>
-          <w:szCs w:val="28"/>
+          <w:sz w:val="32"/>
+          <w:szCs w:val="32"/>
           <w:lang w:eastAsia="es-MX"/>
           <w14:ligatures w14:val="none"/>
         </w:rPr>
@@ -58,10 +94,10 @@
       <w:proofErr w:type="spellStart"/>
       <w:r>
         <w:rPr>
-          <w:rFonts w:ascii="Arial" w:eastAsia="Times New Roman" w:hAnsi="Arial" w:cs="Arial"/>
+          <w:rFonts w:ascii="Times New Roman" w:eastAsia="Times New Roman" w:hAnsi="Times New Roman" w:cs="Times New Roman"/>
           <w:kern w:val="36"/>
-          <w:sz w:val="28"/>
-          <w:szCs w:val="28"/>
+          <w:sz w:val="32"/>
+          <w:szCs w:val="32"/>
           <w:lang w:eastAsia="es-MX"/>
           <w14:ligatures w14:val="none"/>
         </w:rPr>
@@ -479,6 +515,7 @@
           <w:lang w:eastAsia="es-MX"/>
           <w14:ligatures w14:val="none"/>
         </w:rPr>
+        <w:lastRenderedPageBreak/>
         <w:t>Compatibilidad Multiplataforma:</w:t>
       </w:r>
       <w:r>
@@ -544,7 +581,6 @@
           <w:lang w:eastAsia="es-MX"/>
           <w14:ligatures w14:val="none"/>
         </w:rPr>
-        <w:lastRenderedPageBreak/>
         <w:t>Comunicación y Soporte Directo:</w:t>
       </w:r>
       <w:r>
@@ -775,6 +811,685 @@
         </w:rPr>
         <w:t xml:space="preserve"> Eliminar la incertidumbre sobre cómo comunicarse con la entidad, ofreciendo métodos de atención integrados y eficientes.</w:t>
       </w:r>
+    </w:p>
+    <w:p>
+      <w:pPr>
+        <w:spacing w:before="100" w:beforeAutospacing="1" w:after="100" w:afterAutospacing="1" w:line="240" w:lineRule="auto"/>
+        <w:ind w:left="720"/>
+        <w:rPr>
+          <w:rFonts w:ascii="Times New Roman" w:eastAsia="Times New Roman" w:hAnsi="Times New Roman" w:cs="Times New Roman"/>
+          <w:b/>
+          <w:bCs/>
+          <w:kern w:val="0"/>
+          <w:sz w:val="36"/>
+          <w:szCs w:val="36"/>
+          <w:lang w:eastAsia="es-MX"/>
+          <w14:ligatures w14:val="none"/>
+        </w:rPr>
+      </w:pPr>
+      <w:r>
+        <w:rPr>
+          <w:rFonts w:ascii="Times New Roman" w:eastAsia="Times New Roman" w:hAnsi="Times New Roman" w:cs="Times New Roman"/>
+          <w:b/>
+          <w:bCs/>
+          <w:kern w:val="0"/>
+          <w:sz w:val="36"/>
+          <w:szCs w:val="36"/>
+          <w:lang w:eastAsia="es-MX"/>
+          <w14:ligatures w14:val="none"/>
+        </w:rPr>
+        <w:t>Contexto y Escenarios de Uso</w:t>
+      </w:r>
+    </w:p>
+    <w:p>
+      <w:pPr>
+        <w:spacing w:before="100" w:beforeAutospacing="1" w:after="100" w:afterAutospacing="1" w:line="240" w:lineRule="auto"/>
+        <w:ind w:left="720"/>
+        <w:rPr>
+          <w:rFonts w:ascii="Times New Roman" w:eastAsia="Times New Roman" w:hAnsi="Times New Roman" w:cs="Times New Roman"/>
+          <w:b/>
+          <w:bCs/>
+          <w:kern w:val="0"/>
+          <w:sz w:val="32"/>
+          <w:szCs w:val="32"/>
+          <w:lang w:eastAsia="es-MX"/>
+          <w14:ligatures w14:val="none"/>
+        </w:rPr>
+      </w:pPr>
+      <w:r>
+        <w:rPr>
+          <w:rFonts w:ascii="Times New Roman" w:eastAsia="Times New Roman" w:hAnsi="Times New Roman" w:cs="Times New Roman"/>
+          <w:b/>
+          <w:bCs/>
+          <w:kern w:val="0"/>
+          <w:sz w:val="32"/>
+          <w:szCs w:val="32"/>
+          <w:lang w:eastAsia="es-MX"/>
+          <w14:ligatures w14:val="none"/>
+        </w:rPr>
+        <w:t>1. Contexto de uso</w:t>
+      </w:r>
+    </w:p>
+    <w:p>
+      <w:pPr>
+        <w:spacing w:before="100" w:beforeAutospacing="1" w:after="100" w:afterAutospacing="1" w:line="240" w:lineRule="auto"/>
+        <w:ind w:left="720"/>
+        <w:rPr>
+          <w:rFonts w:ascii="Times New Roman" w:eastAsia="Times New Roman" w:hAnsi="Times New Roman" w:cs="Times New Roman"/>
+          <w:kern w:val="0"/>
+          <w:sz w:val="24"/>
+          <w:szCs w:val="24"/>
+          <w:lang w:eastAsia="es-MX"/>
+          <w14:ligatures w14:val="none"/>
+        </w:rPr>
+      </w:pPr>
+      <w:r>
+        <w:rPr>
+          <w:rFonts w:ascii="Times New Roman" w:eastAsia="Times New Roman" w:hAnsi="Times New Roman" w:cs="Times New Roman"/>
+          <w:kern w:val="0"/>
+          <w:sz w:val="24"/>
+          <w:szCs w:val="24"/>
+          <w:lang w:eastAsia="es-MX"/>
+          <w14:ligatures w14:val="none"/>
+        </w:rPr>
+        <w:t>El contexto de uso define el entorno real y las circunstancias bajo las cuales el usuario interactúa con la aplicación o sitio web. Comprenderlo ayuda a diseñar interfaces adaptables y funcionales:</w:t>
+      </w:r>
+    </w:p>
+    <w:p>
+      <w:pPr>
+        <w:numPr>
+          <w:ilvl w:val="0"/>
+          <w:numId w:val="4"/>
+        </w:numPr>
+        <w:spacing w:before="100" w:beforeAutospacing="1" w:after="100" w:afterAutospacing="1" w:line="240" w:lineRule="auto"/>
+        <w:rPr>
+          <w:rFonts w:ascii="Times New Roman" w:eastAsia="Times New Roman" w:hAnsi="Times New Roman" w:cs="Times New Roman"/>
+          <w:kern w:val="0"/>
+          <w:sz w:val="24"/>
+          <w:szCs w:val="24"/>
+          <w:lang w:eastAsia="es-MX"/>
+          <w14:ligatures w14:val="none"/>
+        </w:rPr>
+      </w:pPr>
+      <w:r>
+        <w:rPr>
+          <w:rFonts w:ascii="Times New Roman" w:eastAsia="Times New Roman" w:hAnsi="Times New Roman" w:cs="Times New Roman"/>
+          <w:b/>
+          <w:bCs/>
+          <w:kern w:val="0"/>
+          <w:sz w:val="24"/>
+          <w:szCs w:val="24"/>
+          <w:lang w:eastAsia="es-MX"/>
+          <w14:ligatures w14:val="none"/>
+        </w:rPr>
+        <w:t>Dispositivos en los que navega:</w:t>
+      </w:r>
+      <w:r>
+        <w:rPr>
+          <w:rFonts w:ascii="Times New Roman" w:eastAsia="Times New Roman" w:hAnsi="Times New Roman" w:cs="Times New Roman"/>
+          <w:kern w:val="0"/>
+          <w:sz w:val="24"/>
+          <w:szCs w:val="24"/>
+          <w:lang w:eastAsia="es-MX"/>
+          <w14:ligatures w14:val="none"/>
+        </w:rPr>
+        <w:t xml:space="preserve"> Evaluar si los usuarios acceden desde teléfonos inteligentes (smartphones), tabletas, computadoras de escritorio o laptops. Cada dispositivo exige consideraciones de diseño diferentes (responsive </w:t>
+      </w:r>
+      <w:proofErr w:type="spellStart"/>
+      <w:r>
+        <w:rPr>
+          <w:rFonts w:ascii="Times New Roman" w:eastAsia="Times New Roman" w:hAnsi="Times New Roman" w:cs="Times New Roman"/>
+          <w:kern w:val="0"/>
+          <w:sz w:val="24"/>
+          <w:szCs w:val="24"/>
+          <w:lang w:eastAsia="es-MX"/>
+          <w14:ligatures w14:val="none"/>
+        </w:rPr>
+        <w:t>design</w:t>
+      </w:r>
+      <w:proofErr w:type="spellEnd"/>
+      <w:r>
+        <w:rPr>
+          <w:rFonts w:ascii="Times New Roman" w:eastAsia="Times New Roman" w:hAnsi="Times New Roman" w:cs="Times New Roman"/>
+          <w:kern w:val="0"/>
+          <w:sz w:val="24"/>
+          <w:szCs w:val="24"/>
+          <w:lang w:eastAsia="es-MX"/>
+          <w14:ligatures w14:val="none"/>
+        </w:rPr>
+        <w:t xml:space="preserve">, diseño </w:t>
+      </w:r>
+      <w:proofErr w:type="spellStart"/>
+      <w:r>
+        <w:rPr>
+          <w:rFonts w:ascii="Times New Roman" w:eastAsia="Times New Roman" w:hAnsi="Times New Roman" w:cs="Times New Roman"/>
+          <w:i/>
+          <w:iCs/>
+          <w:kern w:val="0"/>
+          <w:sz w:val="24"/>
+          <w:szCs w:val="24"/>
+          <w:lang w:eastAsia="es-MX"/>
+          <w14:ligatures w14:val="none"/>
+        </w:rPr>
+        <w:t>mobile-first</w:t>
+      </w:r>
+      <w:proofErr w:type="spellEnd"/>
+      <w:r>
+        <w:rPr>
+          <w:rFonts w:ascii="Times New Roman" w:eastAsia="Times New Roman" w:hAnsi="Times New Roman" w:cs="Times New Roman"/>
+          <w:kern w:val="0"/>
+          <w:sz w:val="24"/>
+          <w:szCs w:val="24"/>
+          <w:lang w:eastAsia="es-MX"/>
+          <w14:ligatures w14:val="none"/>
+        </w:rPr>
+        <w:t>, tamaños de botones táctiles vs. uso de ratón).</w:t>
+      </w:r>
+    </w:p>
+    <w:p>
+      <w:pPr>
+        <w:numPr>
+          <w:ilvl w:val="0"/>
+          <w:numId w:val="4"/>
+        </w:numPr>
+        <w:spacing w:before="100" w:beforeAutospacing="1" w:after="100" w:afterAutospacing="1" w:line="240" w:lineRule="auto"/>
+        <w:rPr>
+          <w:rFonts w:ascii="Times New Roman" w:eastAsia="Times New Roman" w:hAnsi="Times New Roman" w:cs="Times New Roman"/>
+          <w:kern w:val="0"/>
+          <w:sz w:val="24"/>
+          <w:szCs w:val="24"/>
+          <w:lang w:eastAsia="es-MX"/>
+          <w14:ligatures w14:val="none"/>
+        </w:rPr>
+      </w:pPr>
+      <w:r>
+        <w:rPr>
+          <w:rFonts w:ascii="Times New Roman" w:eastAsia="Times New Roman" w:hAnsi="Times New Roman" w:cs="Times New Roman"/>
+          <w:b/>
+          <w:bCs/>
+          <w:kern w:val="0"/>
+          <w:sz w:val="24"/>
+          <w:szCs w:val="24"/>
+          <w:lang w:eastAsia="es-MX"/>
+          <w14:ligatures w14:val="none"/>
+        </w:rPr>
+        <w:t>Desde dónde accede:</w:t>
+      </w:r>
+      <w:r>
+        <w:rPr>
+          <w:rFonts w:ascii="Times New Roman" w:eastAsia="Times New Roman" w:hAnsi="Times New Roman" w:cs="Times New Roman"/>
+          <w:kern w:val="0"/>
+          <w:sz w:val="24"/>
+          <w:szCs w:val="24"/>
+          <w:lang w:eastAsia="es-MX"/>
+          <w14:ligatures w14:val="none"/>
+        </w:rPr>
+        <w:t xml:space="preserve"> El entorno físico importa. Puede ser desde un espacio de trabajo tranquilo (oficina/hogar), en movimiento (transporte público, caminando) o en exteriores con luz solar directa, lo que impacta en la legibilidad y el contraste de la pantalla.</w:t>
+      </w:r>
+    </w:p>
+    <w:p>
+      <w:pPr>
+        <w:numPr>
+          <w:ilvl w:val="0"/>
+          <w:numId w:val="4"/>
+        </w:numPr>
+        <w:spacing w:before="100" w:beforeAutospacing="1" w:after="100" w:afterAutospacing="1" w:line="240" w:lineRule="auto"/>
+        <w:rPr>
+          <w:rFonts w:ascii="Times New Roman" w:eastAsia="Times New Roman" w:hAnsi="Times New Roman" w:cs="Times New Roman"/>
+          <w:kern w:val="0"/>
+          <w:sz w:val="24"/>
+          <w:szCs w:val="24"/>
+          <w:lang w:eastAsia="es-MX"/>
+          <w14:ligatures w14:val="none"/>
+        </w:rPr>
+      </w:pPr>
+      <w:r>
+        <w:rPr>
+          <w:rFonts w:ascii="Times New Roman" w:eastAsia="Times New Roman" w:hAnsi="Times New Roman" w:cs="Times New Roman"/>
+          <w:b/>
+          <w:bCs/>
+          <w:kern w:val="0"/>
+          <w:sz w:val="24"/>
+          <w:szCs w:val="24"/>
+          <w:lang w:eastAsia="es-MX"/>
+          <w14:ligatures w14:val="none"/>
+        </w:rPr>
+        <w:lastRenderedPageBreak/>
+        <w:t>Condiciones o momentos:</w:t>
+      </w:r>
+      <w:r>
+        <w:rPr>
+          <w:rFonts w:ascii="Times New Roman" w:eastAsia="Times New Roman" w:hAnsi="Times New Roman" w:cs="Times New Roman"/>
+          <w:kern w:val="0"/>
+          <w:sz w:val="24"/>
+          <w:szCs w:val="24"/>
+          <w:lang w:eastAsia="es-MX"/>
+          <w14:ligatures w14:val="none"/>
+        </w:rPr>
+        <w:t xml:space="preserve"> Considerar el estado del usuario al momento de la interacción (por ejemplo, prisa, distracciones, fatiga, o si cuenta con conectividad a internet estable o limitada).</w:t>
+      </w:r>
+    </w:p>
+    <w:p>
+      <w:pPr>
+        <w:spacing w:before="100" w:beforeAutospacing="1" w:after="100" w:afterAutospacing="1" w:line="240" w:lineRule="auto"/>
+        <w:ind w:left="720"/>
+        <w:rPr>
+          <w:rFonts w:ascii="Times New Roman" w:eastAsia="Times New Roman" w:hAnsi="Times New Roman" w:cs="Times New Roman"/>
+          <w:b/>
+          <w:bCs/>
+          <w:kern w:val="0"/>
+          <w:sz w:val="32"/>
+          <w:szCs w:val="32"/>
+          <w:lang w:eastAsia="es-MX"/>
+          <w14:ligatures w14:val="none"/>
+        </w:rPr>
+      </w:pPr>
+      <w:r>
+        <w:rPr>
+          <w:rFonts w:ascii="Times New Roman" w:eastAsia="Times New Roman" w:hAnsi="Times New Roman" w:cs="Times New Roman"/>
+          <w:b/>
+          <w:bCs/>
+          <w:kern w:val="0"/>
+          <w:sz w:val="32"/>
+          <w:szCs w:val="32"/>
+          <w:lang w:eastAsia="es-MX"/>
+          <w14:ligatures w14:val="none"/>
+        </w:rPr>
+        <w:t>2. Objetivos del usuario</w:t>
+      </w:r>
+    </w:p>
+    <w:p>
+      <w:pPr>
+        <w:spacing w:before="100" w:beforeAutospacing="1" w:after="100" w:afterAutospacing="1" w:line="240" w:lineRule="auto"/>
+        <w:ind w:left="720"/>
+        <w:rPr>
+          <w:rFonts w:ascii="Times New Roman" w:eastAsia="Times New Roman" w:hAnsi="Times New Roman" w:cs="Times New Roman"/>
+          <w:kern w:val="0"/>
+          <w:sz w:val="24"/>
+          <w:szCs w:val="24"/>
+          <w:lang w:eastAsia="es-MX"/>
+          <w14:ligatures w14:val="none"/>
+        </w:rPr>
+      </w:pPr>
+      <w:r>
+        <w:rPr>
+          <w:rFonts w:ascii="Times New Roman" w:eastAsia="Times New Roman" w:hAnsi="Times New Roman" w:cs="Times New Roman"/>
+          <w:kern w:val="0"/>
+          <w:sz w:val="24"/>
+          <w:szCs w:val="24"/>
+          <w:lang w:eastAsia="es-MX"/>
+          <w14:ligatures w14:val="none"/>
+        </w:rPr>
+        <w:t>Los objetivos del usuario son las metas específicas, deseos o tareas concretas que el usuario pretende lograr al interactuar con la página web o aplicación:</w:t>
+      </w:r>
+    </w:p>
+    <w:p>
+      <w:pPr>
+        <w:numPr>
+          <w:ilvl w:val="0"/>
+          <w:numId w:val="5"/>
+        </w:numPr>
+        <w:spacing w:before="100" w:beforeAutospacing="1" w:after="100" w:afterAutospacing="1" w:line="240" w:lineRule="auto"/>
+        <w:rPr>
+          <w:rFonts w:ascii="Times New Roman" w:eastAsia="Times New Roman" w:hAnsi="Times New Roman" w:cs="Times New Roman"/>
+          <w:kern w:val="0"/>
+          <w:sz w:val="24"/>
+          <w:szCs w:val="24"/>
+          <w:lang w:eastAsia="es-MX"/>
+          <w14:ligatures w14:val="none"/>
+        </w:rPr>
+      </w:pPr>
+      <w:r>
+        <w:rPr>
+          <w:rFonts w:ascii="Times New Roman" w:eastAsia="Times New Roman" w:hAnsi="Times New Roman" w:cs="Times New Roman"/>
+          <w:b/>
+          <w:bCs/>
+          <w:kern w:val="0"/>
+          <w:sz w:val="24"/>
+          <w:szCs w:val="24"/>
+          <w:lang w:eastAsia="es-MX"/>
+          <w14:ligatures w14:val="none"/>
+        </w:rPr>
+        <w:t>Metas principales:</w:t>
+      </w:r>
+      <w:r>
+        <w:rPr>
+          <w:rFonts w:ascii="Times New Roman" w:eastAsia="Times New Roman" w:hAnsi="Times New Roman" w:cs="Times New Roman"/>
+          <w:kern w:val="0"/>
+          <w:sz w:val="24"/>
+          <w:szCs w:val="24"/>
+          <w:lang w:eastAsia="es-MX"/>
+          <w14:ligatures w14:val="none"/>
+        </w:rPr>
+        <w:t xml:space="preserve"> ¿Qué problema busca resolver el usuario? (ej. comprar un boleto de avión, buscar información sobre un trámite, cotizar un servicio).</w:t>
+      </w:r>
+    </w:p>
+    <w:p>
+      <w:pPr>
+        <w:numPr>
+          <w:ilvl w:val="0"/>
+          <w:numId w:val="5"/>
+        </w:numPr>
+        <w:spacing w:before="100" w:beforeAutospacing="1" w:after="100" w:afterAutospacing="1" w:line="240" w:lineRule="auto"/>
+        <w:rPr>
+          <w:rFonts w:ascii="Times New Roman" w:eastAsia="Times New Roman" w:hAnsi="Times New Roman" w:cs="Times New Roman"/>
+          <w:kern w:val="0"/>
+          <w:sz w:val="24"/>
+          <w:szCs w:val="24"/>
+          <w:lang w:eastAsia="es-MX"/>
+          <w14:ligatures w14:val="none"/>
+        </w:rPr>
+      </w:pPr>
+      <w:r>
+        <w:rPr>
+          <w:rFonts w:ascii="Times New Roman" w:eastAsia="Times New Roman" w:hAnsi="Times New Roman" w:cs="Times New Roman"/>
+          <w:b/>
+          <w:bCs/>
+          <w:kern w:val="0"/>
+          <w:sz w:val="24"/>
+          <w:szCs w:val="24"/>
+          <w:lang w:eastAsia="es-MX"/>
+          <w14:ligatures w14:val="none"/>
+        </w:rPr>
+        <w:t>Criterios de éxito:</w:t>
+      </w:r>
+      <w:r>
+        <w:rPr>
+          <w:rFonts w:ascii="Times New Roman" w:eastAsia="Times New Roman" w:hAnsi="Times New Roman" w:cs="Times New Roman"/>
+          <w:kern w:val="0"/>
+          <w:sz w:val="24"/>
+          <w:szCs w:val="24"/>
+          <w:lang w:eastAsia="es-MX"/>
+          <w14:ligatures w14:val="none"/>
+        </w:rPr>
+        <w:t xml:space="preserve"> El usuario considerará que su interacción fue exitosa si logra completar la tarea de forma rápida, sin errores frustrantes, con claridad en los pasos a seguir y con la información precisa que necesitaba.</w:t>
+      </w:r>
+    </w:p>
+    <w:p>
+      <w:pPr>
+        <w:spacing w:before="100" w:beforeAutospacing="1" w:after="100" w:afterAutospacing="1" w:line="240" w:lineRule="auto"/>
+        <w:ind w:left="720"/>
+        <w:rPr>
+          <w:rFonts w:ascii="Times New Roman" w:eastAsia="Times New Roman" w:hAnsi="Times New Roman" w:cs="Times New Roman"/>
+          <w:b/>
+          <w:bCs/>
+          <w:kern w:val="0"/>
+          <w:sz w:val="28"/>
+          <w:szCs w:val="28"/>
+          <w:lang w:eastAsia="es-MX"/>
+          <w14:ligatures w14:val="none"/>
+        </w:rPr>
+      </w:pPr>
+      <w:r>
+        <w:rPr>
+          <w:rFonts w:ascii="Times New Roman" w:eastAsia="Times New Roman" w:hAnsi="Times New Roman" w:cs="Times New Roman"/>
+          <w:b/>
+          <w:bCs/>
+          <w:kern w:val="0"/>
+          <w:sz w:val="28"/>
+          <w:szCs w:val="28"/>
+          <w:lang w:eastAsia="es-MX"/>
+          <w14:ligatures w14:val="none"/>
+        </w:rPr>
+        <w:t>3. Escenarios de uso</w:t>
+      </w:r>
+    </w:p>
+    <w:p>
+      <w:pPr>
+        <w:spacing w:before="100" w:beforeAutospacing="1" w:after="100" w:afterAutospacing="1" w:line="240" w:lineRule="auto"/>
+        <w:ind w:left="720"/>
+        <w:rPr>
+          <w:rFonts w:ascii="Times New Roman" w:eastAsia="Times New Roman" w:hAnsi="Times New Roman" w:cs="Times New Roman"/>
+          <w:kern w:val="0"/>
+          <w:sz w:val="24"/>
+          <w:szCs w:val="24"/>
+          <w:lang w:eastAsia="es-MX"/>
+          <w14:ligatures w14:val="none"/>
+        </w:rPr>
+      </w:pPr>
+      <w:r>
+        <w:rPr>
+          <w:rFonts w:ascii="Times New Roman" w:eastAsia="Times New Roman" w:hAnsi="Times New Roman" w:cs="Times New Roman"/>
+          <w:kern w:val="0"/>
+          <w:sz w:val="24"/>
+          <w:szCs w:val="24"/>
+          <w:lang w:eastAsia="es-MX"/>
+          <w14:ligatures w14:val="none"/>
+        </w:rPr>
+        <w:t>Los escenarios de uso son ejemplos prácticos, narrativas o historias de usuario paso a paso que describen cómo un usuario típico interactúa con la plataforma para lograr sus objetivos específicos:</w:t>
+      </w:r>
+    </w:p>
+    <w:p>
+      <w:pPr>
+        <w:numPr>
+          <w:ilvl w:val="0"/>
+          <w:numId w:val="6"/>
+        </w:numPr>
+        <w:spacing w:before="100" w:beforeAutospacing="1" w:after="100" w:afterAutospacing="1" w:line="240" w:lineRule="auto"/>
+        <w:rPr>
+          <w:rFonts w:ascii="Times New Roman" w:eastAsia="Times New Roman" w:hAnsi="Times New Roman" w:cs="Times New Roman"/>
+          <w:kern w:val="0"/>
+          <w:sz w:val="24"/>
+          <w:szCs w:val="24"/>
+          <w:lang w:eastAsia="es-MX"/>
+          <w14:ligatures w14:val="none"/>
+        </w:rPr>
+      </w:pPr>
+      <w:r>
+        <w:rPr>
+          <w:rFonts w:ascii="Times New Roman" w:eastAsia="Times New Roman" w:hAnsi="Times New Roman" w:cs="Times New Roman"/>
+          <w:b/>
+          <w:bCs/>
+          <w:kern w:val="0"/>
+          <w:sz w:val="24"/>
+          <w:szCs w:val="24"/>
+          <w:lang w:eastAsia="es-MX"/>
+          <w14:ligatures w14:val="none"/>
+        </w:rPr>
+        <w:t>Estructura de un escenario de uso:</w:t>
+      </w:r>
+    </w:p>
+    <w:p>
+      <w:pPr>
+        <w:numPr>
+          <w:ilvl w:val="1"/>
+          <w:numId w:val="6"/>
+        </w:numPr>
+        <w:spacing w:before="100" w:beforeAutospacing="1" w:after="100" w:afterAutospacing="1" w:line="240" w:lineRule="auto"/>
+        <w:rPr>
+          <w:rFonts w:ascii="Times New Roman" w:eastAsia="Times New Roman" w:hAnsi="Times New Roman" w:cs="Times New Roman"/>
+          <w:kern w:val="0"/>
+          <w:sz w:val="24"/>
+          <w:szCs w:val="24"/>
+          <w:lang w:eastAsia="es-MX"/>
+          <w14:ligatures w14:val="none"/>
+        </w:rPr>
+      </w:pPr>
+      <w:r>
+        <w:rPr>
+          <w:rFonts w:ascii="Times New Roman" w:eastAsia="Times New Roman" w:hAnsi="Times New Roman" w:cs="Times New Roman"/>
+          <w:i/>
+          <w:iCs/>
+          <w:kern w:val="0"/>
+          <w:sz w:val="24"/>
+          <w:szCs w:val="24"/>
+          <w:lang w:eastAsia="es-MX"/>
+          <w14:ligatures w14:val="none"/>
+        </w:rPr>
+        <w:t>El personaje o usuario:</w:t>
+      </w:r>
+      <w:r>
+        <w:rPr>
+          <w:rFonts w:ascii="Times New Roman" w:eastAsia="Times New Roman" w:hAnsi="Times New Roman" w:cs="Times New Roman"/>
+          <w:kern w:val="0"/>
+          <w:sz w:val="24"/>
+          <w:szCs w:val="24"/>
+          <w:lang w:eastAsia="es-MX"/>
+          <w14:ligatures w14:val="none"/>
+        </w:rPr>
+        <w:t xml:space="preserve"> Breve descripción de quién realiza la acción (ej. "Carlos, un estudiante universitario de 20 años").</w:t>
+      </w:r>
+    </w:p>
+    <w:p>
+      <w:pPr>
+        <w:numPr>
+          <w:ilvl w:val="1"/>
+          <w:numId w:val="6"/>
+        </w:numPr>
+        <w:spacing w:before="100" w:beforeAutospacing="1" w:after="100" w:afterAutospacing="1" w:line="240" w:lineRule="auto"/>
+        <w:rPr>
+          <w:rFonts w:ascii="Times New Roman" w:eastAsia="Times New Roman" w:hAnsi="Times New Roman" w:cs="Times New Roman"/>
+          <w:kern w:val="0"/>
+          <w:sz w:val="24"/>
+          <w:szCs w:val="24"/>
+          <w:lang w:eastAsia="es-MX"/>
+          <w14:ligatures w14:val="none"/>
+        </w:rPr>
+      </w:pPr>
+      <w:r>
+        <w:rPr>
+          <w:rFonts w:ascii="Times New Roman" w:eastAsia="Times New Roman" w:hAnsi="Times New Roman" w:cs="Times New Roman"/>
+          <w:i/>
+          <w:iCs/>
+          <w:kern w:val="0"/>
+          <w:sz w:val="24"/>
+          <w:szCs w:val="24"/>
+          <w:lang w:eastAsia="es-MX"/>
+          <w14:ligatures w14:val="none"/>
+        </w:rPr>
+        <w:t>La situación inicial:</w:t>
+      </w:r>
+      <w:r>
+        <w:rPr>
+          <w:rFonts w:ascii="Times New Roman" w:eastAsia="Times New Roman" w:hAnsi="Times New Roman" w:cs="Times New Roman"/>
+          <w:kern w:val="0"/>
+          <w:sz w:val="24"/>
+          <w:szCs w:val="24"/>
+          <w:lang w:eastAsia="es-MX"/>
+          <w14:ligatures w14:val="none"/>
+        </w:rPr>
+        <w:t xml:space="preserve"> El contexto o necesidad que lo motiva (ej. "Necesita inscribirse a su materia optativa desde su teléfono celular mientras va en el autobús").</w:t>
+      </w:r>
+    </w:p>
+    <w:p>
+      <w:pPr>
+        <w:numPr>
+          <w:ilvl w:val="1"/>
+          <w:numId w:val="6"/>
+        </w:numPr>
+        <w:spacing w:before="100" w:beforeAutospacing="1" w:after="100" w:afterAutospacing="1" w:line="240" w:lineRule="auto"/>
+        <w:rPr>
+          <w:rFonts w:ascii="Times New Roman" w:eastAsia="Times New Roman" w:hAnsi="Times New Roman" w:cs="Times New Roman"/>
+          <w:kern w:val="0"/>
+          <w:sz w:val="24"/>
+          <w:szCs w:val="24"/>
+          <w:lang w:eastAsia="es-MX"/>
+          <w14:ligatures w14:val="none"/>
+        </w:rPr>
+      </w:pPr>
+      <w:r>
+        <w:rPr>
+          <w:rFonts w:ascii="Times New Roman" w:eastAsia="Times New Roman" w:hAnsi="Times New Roman" w:cs="Times New Roman"/>
+          <w:i/>
+          <w:iCs/>
+          <w:kern w:val="0"/>
+          <w:sz w:val="24"/>
+          <w:szCs w:val="24"/>
+          <w:lang w:eastAsia="es-MX"/>
+          <w14:ligatures w14:val="none"/>
+        </w:rPr>
+        <w:t>La interacción paso a paso:</w:t>
+      </w:r>
+      <w:r>
+        <w:rPr>
+          <w:rFonts w:ascii="Times New Roman" w:eastAsia="Times New Roman" w:hAnsi="Times New Roman" w:cs="Times New Roman"/>
+          <w:kern w:val="0"/>
+          <w:sz w:val="24"/>
+          <w:szCs w:val="24"/>
+          <w:lang w:eastAsia="es-MX"/>
+          <w14:ligatures w14:val="none"/>
+        </w:rPr>
+        <w:t xml:space="preserve"> Lo que el usuario hace y cómo responde la interfaz (ej. "1. Abre la </w:t>
+      </w:r>
+      <w:proofErr w:type="gramStart"/>
+      <w:r>
+        <w:rPr>
+          <w:rFonts w:ascii="Times New Roman" w:eastAsia="Times New Roman" w:hAnsi="Times New Roman" w:cs="Times New Roman"/>
+          <w:kern w:val="0"/>
+          <w:sz w:val="24"/>
+          <w:szCs w:val="24"/>
+          <w:lang w:eastAsia="es-MX"/>
+          <w14:ligatures w14:val="none"/>
+        </w:rPr>
+        <w:t>app</w:t>
+      </w:r>
+      <w:proofErr w:type="gramEnd"/>
+      <w:r>
+        <w:rPr>
+          <w:rFonts w:ascii="Times New Roman" w:eastAsia="Times New Roman" w:hAnsi="Times New Roman" w:cs="Times New Roman"/>
+          <w:kern w:val="0"/>
+          <w:sz w:val="24"/>
+          <w:szCs w:val="24"/>
+          <w:lang w:eastAsia="es-MX"/>
+          <w14:ligatures w14:val="none"/>
+        </w:rPr>
+        <w:t xml:space="preserve"> institucional. 2. Ingresa con su huella digital. 3. Busca la sección de inscripciones. 4. Selecciona la materia y confirma").</w:t>
+      </w:r>
+    </w:p>
+    <w:p>
+      <w:pPr>
+        <w:numPr>
+          <w:ilvl w:val="1"/>
+          <w:numId w:val="6"/>
+        </w:numPr>
+        <w:spacing w:before="100" w:beforeAutospacing="1" w:after="100" w:afterAutospacing="1" w:line="240" w:lineRule="auto"/>
+        <w:rPr>
+          <w:rFonts w:ascii="Times New Roman" w:eastAsia="Times New Roman" w:hAnsi="Times New Roman" w:cs="Times New Roman"/>
+          <w:kern w:val="0"/>
+          <w:sz w:val="24"/>
+          <w:szCs w:val="24"/>
+          <w:lang w:eastAsia="es-MX"/>
+          <w14:ligatures w14:val="none"/>
+        </w:rPr>
+      </w:pPr>
+      <w:r>
+        <w:rPr>
+          <w:rFonts w:ascii="Times New Roman" w:eastAsia="Times New Roman" w:hAnsi="Times New Roman" w:cs="Times New Roman"/>
+          <w:i/>
+          <w:iCs/>
+          <w:kern w:val="0"/>
+          <w:sz w:val="24"/>
+          <w:szCs w:val="24"/>
+          <w:lang w:eastAsia="es-MX"/>
+          <w14:ligatures w14:val="none"/>
+        </w:rPr>
+        <w:t>El resultado:</w:t>
+      </w:r>
+      <w:r>
+        <w:rPr>
+          <w:rFonts w:ascii="Times New Roman" w:eastAsia="Times New Roman" w:hAnsi="Times New Roman" w:cs="Times New Roman"/>
+          <w:kern w:val="0"/>
+          <w:sz w:val="24"/>
+          <w:szCs w:val="24"/>
+          <w:lang w:eastAsia="es-MX"/>
+          <w14:ligatures w14:val="none"/>
+        </w:rPr>
+        <w:t xml:space="preserve"> El cumplimiento del objetivo (ej. "Recibe un comprobante digital de inscripción exitosa").</w:t>
+      </w:r>
+    </w:p>
+    <w:p>
+      <w:pPr>
+        <w:spacing w:before="100" w:beforeAutospacing="1" w:after="100" w:afterAutospacing="1" w:line="240" w:lineRule="auto"/>
+        <w:ind w:left="720"/>
+        <w:rPr>
+          <w:rFonts w:ascii="Times New Roman" w:eastAsia="Times New Roman" w:hAnsi="Times New Roman" w:cs="Times New Roman"/>
+          <w:kern w:val="0"/>
+          <w:sz w:val="24"/>
+          <w:szCs w:val="24"/>
+          <w:lang w:eastAsia="es-MX"/>
+          <w14:ligatures w14:val="none"/>
+        </w:rPr>
+      </w:pPr>
     </w:p>
     <w:p/>
     <w:sectPr>
@@ -788,7 +1503,7 @@
 </file>
 
 <file path=word/numbering.xml><?xml version="1.0" encoding="utf-8"?>
-<w:numbering xmlns:wpc="http://schemas.microsoft.com/office/word/2010/wordprocessingCanvas" xmlns:cx="http://schemas.microsoft.com/office/drawing/2014/chartex" xmlns:cx1="http://schemas.microsoft.com/office/drawing/2015/9/8/chartex" xmlns:cx2="http://schemas.microsoft.com/office/drawing/2015/10/21/chartex" xmlns:cx3="http://schemas.microsoft.com/office/drawing/2016/5/9/chartex" xmlns:cx4="http://schemas.microsoft.com/office/drawing/2016/5/10/chartex" xmlns:cx5="http://schemas.microsoft.com/office/drawing/2016/5/11/chartex" xmlns:cx6="http://schemas.microsoft.com/office/drawing/2016/5/12/chartex" xmlns:cx7="http://schemas.microsoft.com/office/drawing/2016/5/13/chartex" xmlns:cx8="http://schemas.microsoft.com/office/drawing/2016/5/14/chartex" xmlns:mc="http://schemas.openxmlformats.org/markup-compatibility/2006" xmlns:aink="http://schemas.microsoft.com/office/drawing/2016/ink" xmlns:am3d="http://schemas.microsoft.com/office/drawing/2017/model3d" xmlns:o="urn:schemas-microsoft-com:office:office" xmlns:oel="http://schemas.microsoft.com/office/2019/extlst" xmlns:r="http://schemas.openxmlformats.org/officeDocument/2006/relationships" xmlns:m="http://schemas.openxmlformats.org/officeDocument/2006/math" xmlns:v="urn:schemas-microsoft-com:vml" xmlns:wp14="http://schemas.microsoft.com/office/word/2010/wordprocessingDrawing" xmlns:wp="http://schemas.openxmlformats.org/drawingml/2006/wordprocessingDrawing" xmlns:w10="urn:schemas-microsoft-com:office:word" xmlns:w="http://schemas.openxmlformats.org/wordprocessingml/2006/main" xmlns:w14="http://schemas.microsoft.com/office/word/2010/wordml" xmlns:w15="http://schemas.microsoft.com/office/word/2012/wordml" xmlns:w16cex="http://schemas.microsoft.com/office/word/2018/wordml/cex" xmlns:w16cid="http://schemas.microsoft.com/office/word/2016/wordml/cid" xmlns:w16="http://schemas.microsoft.com/office/word/2018/wordml" xmlns:w16du="http://schemas.microsoft.com/office/word/2023/wordml/word16du" xmlns:w16sdtdh="http://schemas.microsoft.com/office/word/2020/wordml/sdtdatahash" xmlns:w16se="http://schemas.microsoft.com/office/word/2015/wordml/symex" xmlns:wpg="http://schemas.microsoft.com/office/word/2010/wordprocessingGroup" xmlns:wpi="http://schemas.microsoft.com/office/word/2010/wordprocessingInk" xmlns:wne="http://schemas.microsoft.com/office/word/2006/wordml" xmlns:wps="http://schemas.microsoft.com/office/word/2010/wordprocessingShape" mc:Ignorable="w14 w15 w16se w16cid w16 w16cex w16sdtdh w16du wp14">
+<w:numbering xmlns:wpc="http://schemas.microsoft.com/office/word/2010/wordprocessingCanvas" xmlns:cx="http://schemas.microsoft.com/office/drawing/2014/chartex" xmlns:cx1="http://schemas.microsoft.com/office/drawing/2015/9/8/chartex" xmlns:cx2="http://schemas.microsoft.com/office/drawing/2015/10/21/chartex" xmlns:cx3="http://schemas.microsoft.com/office/drawing/2016/5/9/chartex" xmlns:cx4="http://schemas.microsoft.com/office/drawing/2016/5/10/chartex" xmlns:cx5="http://schemas.microsoft.com/office/drawing/2016/5/11/chartex" xmlns:cx6="http://schemas.microsoft.com/office/drawing/2016/5/12/chartex" xmlns:cx7="http://schemas.microsoft.com/office/drawing/2016/5/13/chartex" xmlns:cx8="http://schemas.microsoft.com/office/drawing/2016/5/14/chartex" xmlns:mc="http://schemas.openxmlformats.org/markup-compatibility/2006" xmlns:aink="http://schemas.microsoft.com/office/drawing/2016/ink" xmlns:am3d="http://schemas.microsoft.com/office/drawing/2017/model3d" xmlns:o="urn:schemas-microsoft-com:office:office" xmlns:oel="http://schemas.microsoft.com/office/2019/extlst" xmlns:r="http://schemas.openxmlformats.org/officeDocument/2006/relationships" xmlns:m="http://schemas.openxmlformats.org/officeDocument/2006/math" xmlns:v="urn:schemas-microsoft-com:vml" xmlns:wp14="http://schemas.microsoft.com/office/word/2010/wordprocessingDrawing" xmlns:wp="http://schemas.openxmlformats.org/drawingml/2006/wordprocessingDrawing" xmlns:w10="urn:schemas-microsoft-com:office:word" xmlns:w="http://schemas.openxmlformats.org/wordprocessingml/2006/main" xmlns:w14="http://schemas.microsoft.com/office/word/2010/wordml" xmlns:w15="http://schemas.microsoft.com/office/word/2012/wordml" xmlns:w16cex="http://schemas.microsoft.com/office/word/2018/wordml/cex" xmlns:w16cid="http://schemas.microsoft.com/office/word/2016/wordml/cid" xmlns:w16="http://schemas.microsoft.com/office/word/2018/wordml" xmlns:w16du="http://schemas.microsoft.com/office/word/2023/wordml/word16du" xmlns:w16sdtdh="http://schemas.microsoft.com/office/word/2020/wordml/sdtdatahash" xmlns:w16sdtfl="http://schemas.microsoft.com/office/word/2024/wordml/sdtformatlock" xmlns:w16se="http://schemas.microsoft.com/office/word/2015/wordml/symex" xmlns:wpg="http://schemas.microsoft.com/office/word/2010/wordprocessingGroup" xmlns:wpi="http://schemas.microsoft.com/office/word/2010/wordprocessingInk" xmlns:wne="http://schemas.microsoft.com/office/word/2006/wordml" xmlns:wps="http://schemas.microsoft.com/office/word/2010/wordprocessingShape" mc:Ignorable="w14 w15 w16se w16cid w16 w16cex w16sdtdh w16sdtfl w16du wp14">
   <w:abstractNum w:abstractNumId="0" w15:restartNumberingAfterBreak="0">
     <w:nsid w:val="148D2307"/>
     <w:multiLevelType w:val="multilevel"/>
@@ -939,6 +1654,155 @@
     </w:lvl>
   </w:abstractNum>
   <w:abstractNum w:abstractNumId="1" w15:restartNumberingAfterBreak="0">
+    <w:nsid w:val="20384505"/>
+    <w:multiLevelType w:val="multilevel"/>
+    <w:tmpl w:val="22A0C500"/>
+    <w:lvl w:ilvl="0">
+      <w:start w:val="1"/>
+      <w:numFmt w:val="bullet"/>
+      <w:lvlText w:val=""/>
+      <w:lvlJc w:val="left"/>
+      <w:pPr>
+        <w:tabs>
+          <w:tab w:val="num" w:pos="720"/>
+        </w:tabs>
+        <w:ind w:left="720" w:hanging="360"/>
+      </w:pPr>
+      <w:rPr>
+        <w:rFonts w:ascii="Symbol" w:hAnsi="Symbol" w:hint="default"/>
+        <w:sz w:val="20"/>
+      </w:rPr>
+    </w:lvl>
+    <w:lvl w:ilvl="1" w:tentative="1">
+      <w:start w:val="1"/>
+      <w:numFmt w:val="bullet"/>
+      <w:lvlText w:val="o"/>
+      <w:lvlJc w:val="left"/>
+      <w:pPr>
+        <w:tabs>
+          <w:tab w:val="num" w:pos="1440"/>
+        </w:tabs>
+        <w:ind w:left="1440" w:hanging="360"/>
+      </w:pPr>
+      <w:rPr>
+        <w:rFonts w:ascii="Courier New" w:hAnsi="Courier New" w:hint="default"/>
+        <w:sz w:val="20"/>
+      </w:rPr>
+    </w:lvl>
+    <w:lvl w:ilvl="2" w:tentative="1">
+      <w:start w:val="1"/>
+      <w:numFmt w:val="bullet"/>
+      <w:lvlText w:val=""/>
+      <w:lvlJc w:val="left"/>
+      <w:pPr>
+        <w:tabs>
+          <w:tab w:val="num" w:pos="2160"/>
+        </w:tabs>
+        <w:ind w:left="2160" w:hanging="360"/>
+      </w:pPr>
+      <w:rPr>
+        <w:rFonts w:ascii="Wingdings" w:hAnsi="Wingdings" w:hint="default"/>
+        <w:sz w:val="20"/>
+      </w:rPr>
+    </w:lvl>
+    <w:lvl w:ilvl="3" w:tentative="1">
+      <w:start w:val="1"/>
+      <w:numFmt w:val="bullet"/>
+      <w:lvlText w:val=""/>
+      <w:lvlJc w:val="left"/>
+      <w:pPr>
+        <w:tabs>
+          <w:tab w:val="num" w:pos="2880"/>
+        </w:tabs>
+        <w:ind w:left="2880" w:hanging="360"/>
+      </w:pPr>
+      <w:rPr>
+        <w:rFonts w:ascii="Wingdings" w:hAnsi="Wingdings" w:hint="default"/>
+        <w:sz w:val="20"/>
+      </w:rPr>
+    </w:lvl>
+    <w:lvl w:ilvl="4" w:tentative="1">
+      <w:start w:val="1"/>
+      <w:numFmt w:val="bullet"/>
+      <w:lvlText w:val=""/>
+      <w:lvlJc w:val="left"/>
+      <w:pPr>
+        <w:tabs>
+          <w:tab w:val="num" w:pos="3600"/>
+        </w:tabs>
+        <w:ind w:left="3600" w:hanging="360"/>
+      </w:pPr>
+      <w:rPr>
+        <w:rFonts w:ascii="Wingdings" w:hAnsi="Wingdings" w:hint="default"/>
+        <w:sz w:val="20"/>
+      </w:rPr>
+    </w:lvl>
+    <w:lvl w:ilvl="5" w:tentative="1">
+      <w:start w:val="1"/>
+      <w:numFmt w:val="bullet"/>
+      <w:lvlText w:val=""/>
+      <w:lvlJc w:val="left"/>
+      <w:pPr>
+        <w:tabs>
+          <w:tab w:val="num" w:pos="4320"/>
+        </w:tabs>
+        <w:ind w:left="4320" w:hanging="360"/>
+      </w:pPr>
+      <w:rPr>
+        <w:rFonts w:ascii="Wingdings" w:hAnsi="Wingdings" w:hint="default"/>
+        <w:sz w:val="20"/>
+      </w:rPr>
+    </w:lvl>
+    <w:lvl w:ilvl="6" w:tentative="1">
+      <w:start w:val="1"/>
+      <w:numFmt w:val="bullet"/>
+      <w:lvlText w:val=""/>
+      <w:lvlJc w:val="left"/>
+      <w:pPr>
+        <w:tabs>
+          <w:tab w:val="num" w:pos="5040"/>
+        </w:tabs>
+        <w:ind w:left="5040" w:hanging="360"/>
+      </w:pPr>
+      <w:rPr>
+        <w:rFonts w:ascii="Wingdings" w:hAnsi="Wingdings" w:hint="default"/>
+        <w:sz w:val="20"/>
+      </w:rPr>
+    </w:lvl>
+    <w:lvl w:ilvl="7" w:tentative="1">
+      <w:start w:val="1"/>
+      <w:numFmt w:val="bullet"/>
+      <w:lvlText w:val=""/>
+      <w:lvlJc w:val="left"/>
+      <w:pPr>
+        <w:tabs>
+          <w:tab w:val="num" w:pos="5760"/>
+        </w:tabs>
+        <w:ind w:left="5760" w:hanging="360"/>
+      </w:pPr>
+      <w:rPr>
+        <w:rFonts w:ascii="Wingdings" w:hAnsi="Wingdings" w:hint="default"/>
+        <w:sz w:val="20"/>
+      </w:rPr>
+    </w:lvl>
+    <w:lvl w:ilvl="8" w:tentative="1">
+      <w:start w:val="1"/>
+      <w:numFmt w:val="bullet"/>
+      <w:lvlText w:val=""/>
+      <w:lvlJc w:val="left"/>
+      <w:pPr>
+        <w:tabs>
+          <w:tab w:val="num" w:pos="6480"/>
+        </w:tabs>
+        <w:ind w:left="6480" w:hanging="360"/>
+      </w:pPr>
+      <w:rPr>
+        <w:rFonts w:ascii="Wingdings" w:hAnsi="Wingdings" w:hint="default"/>
+        <w:sz w:val="20"/>
+      </w:rPr>
+    </w:lvl>
+  </w:abstractNum>
+  <w:abstractNum w:abstractNumId="2" w15:restartNumberingAfterBreak="0">
     <w:nsid w:val="3AF46292"/>
     <w:multiLevelType w:val="multilevel"/>
     <w:tmpl w:val="7AD6D132"/>
@@ -1087,7 +1951,7 @@
       </w:rPr>
     </w:lvl>
   </w:abstractNum>
-  <w:abstractNum w:abstractNumId="2" w15:restartNumberingAfterBreak="0">
+  <w:abstractNum w:abstractNumId="3" w15:restartNumberingAfterBreak="0">
     <w:nsid w:val="44B877A1"/>
     <w:multiLevelType w:val="multilevel"/>
     <w:tmpl w:val="76B20060"/>
@@ -1122,6 +1986,300 @@
         <w:rFonts w:ascii="Courier New" w:hAnsi="Courier New" w:hint="default"/>
         <w:sz w:val="20"/>
       </w:rPr>
+    </w:lvl>
+    <w:lvl w:ilvl="2" w:tentative="1">
+      <w:start w:val="1"/>
+      <w:numFmt w:val="bullet"/>
+      <w:lvlText w:val=""/>
+      <w:lvlJc w:val="left"/>
+      <w:pPr>
+        <w:tabs>
+          <w:tab w:val="num" w:pos="2160"/>
+        </w:tabs>
+        <w:ind w:left="2160" w:hanging="360"/>
+      </w:pPr>
+      <w:rPr>
+        <w:rFonts w:ascii="Wingdings" w:hAnsi="Wingdings" w:hint="default"/>
+        <w:sz w:val="20"/>
+      </w:rPr>
+    </w:lvl>
+    <w:lvl w:ilvl="3" w:tentative="1">
+      <w:start w:val="1"/>
+      <w:numFmt w:val="bullet"/>
+      <w:lvlText w:val=""/>
+      <w:lvlJc w:val="left"/>
+      <w:pPr>
+        <w:tabs>
+          <w:tab w:val="num" w:pos="2880"/>
+        </w:tabs>
+        <w:ind w:left="2880" w:hanging="360"/>
+      </w:pPr>
+      <w:rPr>
+        <w:rFonts w:ascii="Wingdings" w:hAnsi="Wingdings" w:hint="default"/>
+        <w:sz w:val="20"/>
+      </w:rPr>
+    </w:lvl>
+    <w:lvl w:ilvl="4" w:tentative="1">
+      <w:start w:val="1"/>
+      <w:numFmt w:val="bullet"/>
+      <w:lvlText w:val=""/>
+      <w:lvlJc w:val="left"/>
+      <w:pPr>
+        <w:tabs>
+          <w:tab w:val="num" w:pos="3600"/>
+        </w:tabs>
+        <w:ind w:left="3600" w:hanging="360"/>
+      </w:pPr>
+      <w:rPr>
+        <w:rFonts w:ascii="Wingdings" w:hAnsi="Wingdings" w:hint="default"/>
+        <w:sz w:val="20"/>
+      </w:rPr>
+    </w:lvl>
+    <w:lvl w:ilvl="5" w:tentative="1">
+      <w:start w:val="1"/>
+      <w:numFmt w:val="bullet"/>
+      <w:lvlText w:val=""/>
+      <w:lvlJc w:val="left"/>
+      <w:pPr>
+        <w:tabs>
+          <w:tab w:val="num" w:pos="4320"/>
+        </w:tabs>
+        <w:ind w:left="4320" w:hanging="360"/>
+      </w:pPr>
+      <w:rPr>
+        <w:rFonts w:ascii="Wingdings" w:hAnsi="Wingdings" w:hint="default"/>
+        <w:sz w:val="20"/>
+      </w:rPr>
+    </w:lvl>
+    <w:lvl w:ilvl="6" w:tentative="1">
+      <w:start w:val="1"/>
+      <w:numFmt w:val="bullet"/>
+      <w:lvlText w:val=""/>
+      <w:lvlJc w:val="left"/>
+      <w:pPr>
+        <w:tabs>
+          <w:tab w:val="num" w:pos="5040"/>
+        </w:tabs>
+        <w:ind w:left="5040" w:hanging="360"/>
+      </w:pPr>
+      <w:rPr>
+        <w:rFonts w:ascii="Wingdings" w:hAnsi="Wingdings" w:hint="default"/>
+        <w:sz w:val="20"/>
+      </w:rPr>
+    </w:lvl>
+    <w:lvl w:ilvl="7" w:tentative="1">
+      <w:start w:val="1"/>
+      <w:numFmt w:val="bullet"/>
+      <w:lvlText w:val=""/>
+      <w:lvlJc w:val="left"/>
+      <w:pPr>
+        <w:tabs>
+          <w:tab w:val="num" w:pos="5760"/>
+        </w:tabs>
+        <w:ind w:left="5760" w:hanging="360"/>
+      </w:pPr>
+      <w:rPr>
+        <w:rFonts w:ascii="Wingdings" w:hAnsi="Wingdings" w:hint="default"/>
+        <w:sz w:val="20"/>
+      </w:rPr>
+    </w:lvl>
+    <w:lvl w:ilvl="8" w:tentative="1">
+      <w:start w:val="1"/>
+      <w:numFmt w:val="bullet"/>
+      <w:lvlText w:val=""/>
+      <w:lvlJc w:val="left"/>
+      <w:pPr>
+        <w:tabs>
+          <w:tab w:val="num" w:pos="6480"/>
+        </w:tabs>
+        <w:ind w:left="6480" w:hanging="360"/>
+      </w:pPr>
+      <w:rPr>
+        <w:rFonts w:ascii="Wingdings" w:hAnsi="Wingdings" w:hint="default"/>
+        <w:sz w:val="20"/>
+      </w:rPr>
+    </w:lvl>
+  </w:abstractNum>
+  <w:abstractNum w:abstractNumId="4" w15:restartNumberingAfterBreak="0">
+    <w:nsid w:val="44C0366E"/>
+    <w:multiLevelType w:val="multilevel"/>
+    <w:tmpl w:val="BC861660"/>
+    <w:lvl w:ilvl="0">
+      <w:start w:val="1"/>
+      <w:numFmt w:val="bullet"/>
+      <w:lvlText w:val=""/>
+      <w:lvlJc w:val="left"/>
+      <w:pPr>
+        <w:tabs>
+          <w:tab w:val="num" w:pos="720"/>
+        </w:tabs>
+        <w:ind w:left="720" w:hanging="360"/>
+      </w:pPr>
+      <w:rPr>
+        <w:rFonts w:ascii="Symbol" w:hAnsi="Symbol" w:hint="default"/>
+        <w:sz w:val="20"/>
+      </w:rPr>
+    </w:lvl>
+    <w:lvl w:ilvl="1" w:tentative="1">
+      <w:start w:val="1"/>
+      <w:numFmt w:val="bullet"/>
+      <w:lvlText w:val="o"/>
+      <w:lvlJc w:val="left"/>
+      <w:pPr>
+        <w:tabs>
+          <w:tab w:val="num" w:pos="1440"/>
+        </w:tabs>
+        <w:ind w:left="1440" w:hanging="360"/>
+      </w:pPr>
+      <w:rPr>
+        <w:rFonts w:ascii="Courier New" w:hAnsi="Courier New" w:hint="default"/>
+        <w:sz w:val="20"/>
+      </w:rPr>
+    </w:lvl>
+    <w:lvl w:ilvl="2" w:tentative="1">
+      <w:start w:val="1"/>
+      <w:numFmt w:val="bullet"/>
+      <w:lvlText w:val=""/>
+      <w:lvlJc w:val="left"/>
+      <w:pPr>
+        <w:tabs>
+          <w:tab w:val="num" w:pos="2160"/>
+        </w:tabs>
+        <w:ind w:left="2160" w:hanging="360"/>
+      </w:pPr>
+      <w:rPr>
+        <w:rFonts w:ascii="Wingdings" w:hAnsi="Wingdings" w:hint="default"/>
+        <w:sz w:val="20"/>
+      </w:rPr>
+    </w:lvl>
+    <w:lvl w:ilvl="3" w:tentative="1">
+      <w:start w:val="1"/>
+      <w:numFmt w:val="bullet"/>
+      <w:lvlText w:val=""/>
+      <w:lvlJc w:val="left"/>
+      <w:pPr>
+        <w:tabs>
+          <w:tab w:val="num" w:pos="2880"/>
+        </w:tabs>
+        <w:ind w:left="2880" w:hanging="360"/>
+      </w:pPr>
+      <w:rPr>
+        <w:rFonts w:ascii="Wingdings" w:hAnsi="Wingdings" w:hint="default"/>
+        <w:sz w:val="20"/>
+      </w:rPr>
+    </w:lvl>
+    <w:lvl w:ilvl="4" w:tentative="1">
+      <w:start w:val="1"/>
+      <w:numFmt w:val="bullet"/>
+      <w:lvlText w:val=""/>
+      <w:lvlJc w:val="left"/>
+      <w:pPr>
+        <w:tabs>
+          <w:tab w:val="num" w:pos="3600"/>
+        </w:tabs>
+        <w:ind w:left="3600" w:hanging="360"/>
+      </w:pPr>
+      <w:rPr>
+        <w:rFonts w:ascii="Wingdings" w:hAnsi="Wingdings" w:hint="default"/>
+        <w:sz w:val="20"/>
+      </w:rPr>
+    </w:lvl>
+    <w:lvl w:ilvl="5" w:tentative="1">
+      <w:start w:val="1"/>
+      <w:numFmt w:val="bullet"/>
+      <w:lvlText w:val=""/>
+      <w:lvlJc w:val="left"/>
+      <w:pPr>
+        <w:tabs>
+          <w:tab w:val="num" w:pos="4320"/>
+        </w:tabs>
+        <w:ind w:left="4320" w:hanging="360"/>
+      </w:pPr>
+      <w:rPr>
+        <w:rFonts w:ascii="Wingdings" w:hAnsi="Wingdings" w:hint="default"/>
+        <w:sz w:val="20"/>
+      </w:rPr>
+    </w:lvl>
+    <w:lvl w:ilvl="6" w:tentative="1">
+      <w:start w:val="1"/>
+      <w:numFmt w:val="bullet"/>
+      <w:lvlText w:val=""/>
+      <w:lvlJc w:val="left"/>
+      <w:pPr>
+        <w:tabs>
+          <w:tab w:val="num" w:pos="5040"/>
+        </w:tabs>
+        <w:ind w:left="5040" w:hanging="360"/>
+      </w:pPr>
+      <w:rPr>
+        <w:rFonts w:ascii="Wingdings" w:hAnsi="Wingdings" w:hint="default"/>
+        <w:sz w:val="20"/>
+      </w:rPr>
+    </w:lvl>
+    <w:lvl w:ilvl="7" w:tentative="1">
+      <w:start w:val="1"/>
+      <w:numFmt w:val="bullet"/>
+      <w:lvlText w:val=""/>
+      <w:lvlJc w:val="left"/>
+      <w:pPr>
+        <w:tabs>
+          <w:tab w:val="num" w:pos="5760"/>
+        </w:tabs>
+        <w:ind w:left="5760" w:hanging="360"/>
+      </w:pPr>
+      <w:rPr>
+        <w:rFonts w:ascii="Wingdings" w:hAnsi="Wingdings" w:hint="default"/>
+        <w:sz w:val="20"/>
+      </w:rPr>
+    </w:lvl>
+    <w:lvl w:ilvl="8" w:tentative="1">
+      <w:start w:val="1"/>
+      <w:numFmt w:val="bullet"/>
+      <w:lvlText w:val=""/>
+      <w:lvlJc w:val="left"/>
+      <w:pPr>
+        <w:tabs>
+          <w:tab w:val="num" w:pos="6480"/>
+        </w:tabs>
+        <w:ind w:left="6480" w:hanging="360"/>
+      </w:pPr>
+      <w:rPr>
+        <w:rFonts w:ascii="Wingdings" w:hAnsi="Wingdings" w:hint="default"/>
+        <w:sz w:val="20"/>
+      </w:rPr>
+    </w:lvl>
+  </w:abstractNum>
+  <w:abstractNum w:abstractNumId="5" w15:restartNumberingAfterBreak="0">
+    <w:nsid w:val="735E387F"/>
+    <w:multiLevelType w:val="multilevel"/>
+    <w:tmpl w:val="3FE48CE4"/>
+    <w:lvl w:ilvl="0">
+      <w:start w:val="1"/>
+      <w:numFmt w:val="bullet"/>
+      <w:lvlText w:val=""/>
+      <w:lvlJc w:val="left"/>
+      <w:pPr>
+        <w:tabs>
+          <w:tab w:val="num" w:pos="720"/>
+        </w:tabs>
+        <w:ind w:left="720" w:hanging="360"/>
+      </w:pPr>
+      <w:rPr>
+        <w:rFonts w:ascii="Symbol" w:hAnsi="Symbol" w:hint="default"/>
+        <w:sz w:val="20"/>
+      </w:rPr>
+    </w:lvl>
+    <w:lvl w:ilvl="1">
+      <w:start w:val="1"/>
+      <w:numFmt w:val="decimal"/>
+      <w:lvlText w:val="%2."/>
+      <w:lvlJc w:val="left"/>
+      <w:pPr>
+        <w:tabs>
+          <w:tab w:val="num" w:pos="1440"/>
+        </w:tabs>
+        <w:ind w:left="1440" w:hanging="360"/>
+      </w:pPr>
     </w:lvl>
     <w:lvl w:ilvl="2" w:tentative="1">
       <w:start w:val="1"/>
@@ -1240,16 +2398,25 @@
     <w:abstractNumId w:val="0"/>
   </w:num>
   <w:num w:numId="2" w16cid:durableId="1379428383">
+    <w:abstractNumId w:val="3"/>
+  </w:num>
+  <w:num w:numId="3" w16cid:durableId="281156672">
     <w:abstractNumId w:val="2"/>
   </w:num>
-  <w:num w:numId="3" w16cid:durableId="281156672">
+  <w:num w:numId="4" w16cid:durableId="1817986069">
+    <w:abstractNumId w:val="4"/>
+  </w:num>
+  <w:num w:numId="5" w16cid:durableId="584263181">
     <w:abstractNumId w:val="1"/>
+  </w:num>
+  <w:num w:numId="6" w16cid:durableId="1383478191">
+    <w:abstractNumId w:val="5"/>
   </w:num>
 </w:numbering>
 </file>
 
 <file path=word/styles.xml><?xml version="1.0" encoding="utf-8"?>
-<w:styles xmlns:mc="http://schemas.openxmlformats.org/markup-compatibility/2006" xmlns:r="http://schemas.openxmlformats.org/officeDocument/2006/relationships" xmlns:w="http://schemas.openxmlformats.org/wordprocessingml/2006/main" xmlns:w14="http://schemas.microsoft.com/office/word/2010/wordml" xmlns:w15="http://schemas.microsoft.com/office/word/2012/wordml" xmlns:w16cex="http://schemas.microsoft.com/office/word/2018/wordml/cex" xmlns:w16cid="http://schemas.microsoft.com/office/word/2016/wordml/cid" xmlns:w16="http://schemas.microsoft.com/office/word/2018/wordml" xmlns:w16du="http://schemas.microsoft.com/office/word/2023/wordml/word16du" xmlns:w16sdtdh="http://schemas.microsoft.com/office/word/2020/wordml/sdtdatahash" xmlns:w16se="http://schemas.microsoft.com/office/word/2015/wordml/symex" mc:Ignorable="w14 w15 w16se w16cid w16 w16cex w16sdtdh w16du">
+<w:styles xmlns:mc="http://schemas.openxmlformats.org/markup-compatibility/2006" xmlns:r="http://schemas.openxmlformats.org/officeDocument/2006/relationships" xmlns:w="http://schemas.openxmlformats.org/wordprocessingml/2006/main" xmlns:w14="http://schemas.microsoft.com/office/word/2010/wordml" xmlns:w15="http://schemas.microsoft.com/office/word/2012/wordml" xmlns:w16cex="http://schemas.microsoft.com/office/word/2018/wordml/cex" xmlns:w16cid="http://schemas.microsoft.com/office/word/2016/wordml/cid" xmlns:w16="http://schemas.microsoft.com/office/word/2018/wordml" xmlns:w16du="http://schemas.microsoft.com/office/word/2023/wordml/word16du" xmlns:w16sdtdh="http://schemas.microsoft.com/office/word/2020/wordml/sdtdatahash" xmlns:w16sdtfl="http://schemas.microsoft.com/office/word/2024/wordml/sdtformatlock" xmlns:w16se="http://schemas.microsoft.com/office/word/2015/wordml/symex" mc:Ignorable="w14 w15 w16se w16cid w16 w16cex w16sdtdh w16sdtfl w16du">
   <w:docDefaults>
     <w:rPrDefault>
       <w:rPr>
@@ -1693,10 +2860,55 @@
       <w14:ligatures w14:val="none"/>
     </w:rPr>
   </w:style>
+  <w:style w:type="paragraph" w:styleId="Ttulo3">
+    <w:name w:val="heading 3"/>
+    <w:basedOn w:val="Normal"/>
+    <w:next w:val="Normal"/>
+    <w:link w:val="Ttulo3Car"/>
+    <w:uiPriority w:val="9"/>
+    <w:semiHidden/>
+    <w:unhideWhenUsed/>
+    <w:qFormat/>
+    <w:rsid w:val="00B23C3A"/>
+    <w:pPr>
+      <w:keepNext/>
+      <w:keepLines/>
+      <w:spacing w:before="40" w:after="0"/>
+      <w:outlineLvl w:val="2"/>
+    </w:pPr>
+    <w:rPr>
+      <w:rFonts w:asciiTheme="majorHAnsi" w:eastAsiaTheme="majorEastAsia" w:hAnsiTheme="majorHAnsi" w:cstheme="majorBidi"/>
+      <w:color w:val="1F3763" w:themeColor="accent1" w:themeShade="7F"/>
+      <w:sz w:val="24"/>
+      <w:szCs w:val="24"/>
+    </w:rPr>
+  </w:style>
+  <w:style w:type="paragraph" w:styleId="Ttulo4">
+    <w:name w:val="heading 4"/>
+    <w:basedOn w:val="Normal"/>
+    <w:next w:val="Normal"/>
+    <w:link w:val="Ttulo4Car"/>
+    <w:uiPriority w:val="9"/>
+    <w:semiHidden/>
+    <w:unhideWhenUsed/>
+    <w:qFormat/>
+    <w:rsid w:val="00B23C3A"/>
+    <w:pPr>
+      <w:keepNext/>
+      <w:keepLines/>
+      <w:spacing w:before="40" w:after="0"/>
+      <w:outlineLvl w:val="3"/>
+    </w:pPr>
+    <w:rPr>
+      <w:rFonts w:asciiTheme="majorHAnsi" w:eastAsiaTheme="majorEastAsia" w:hAnsiTheme="majorHAnsi" w:cstheme="majorBidi"/>
+      <w:i/>
+      <w:iCs/>
+      <w:color w:val="2F5496" w:themeColor="accent1" w:themeShade="BF"/>
+    </w:rPr>
+  </w:style>
   <w:style w:type="character" w:default="1" w:styleId="Fuentedeprrafopredeter">
     <w:name w:val="Default Paragraph Font"/>
     <w:uiPriority w:val="1"/>
-    <w:semiHidden/>
     <w:unhideWhenUsed/>
   </w:style>
   <w:style w:type="table" w:default="1" w:styleId="Tablanormal">
@@ -1771,6 +2983,34 @@
       <w:szCs w:val="24"/>
       <w:lang w:eastAsia="es-MX"/>
       <w14:ligatures w14:val="none"/>
+    </w:rPr>
+  </w:style>
+  <w:style w:type="character" w:customStyle="1" w:styleId="Ttulo3Car">
+    <w:name w:val="Título 3 Car"/>
+    <w:basedOn w:val="Fuentedeprrafopredeter"/>
+    <w:link w:val="Ttulo3"/>
+    <w:uiPriority w:val="9"/>
+    <w:semiHidden/>
+    <w:rsid w:val="00B23C3A"/>
+    <w:rPr>
+      <w:rFonts w:asciiTheme="majorHAnsi" w:eastAsiaTheme="majorEastAsia" w:hAnsiTheme="majorHAnsi" w:cstheme="majorBidi"/>
+      <w:color w:val="1F3763" w:themeColor="accent1" w:themeShade="7F"/>
+      <w:sz w:val="24"/>
+      <w:szCs w:val="24"/>
+    </w:rPr>
+  </w:style>
+  <w:style w:type="character" w:customStyle="1" w:styleId="Ttulo4Car">
+    <w:name w:val="Título 4 Car"/>
+    <w:basedOn w:val="Fuentedeprrafopredeter"/>
+    <w:link w:val="Ttulo4"/>
+    <w:uiPriority w:val="9"/>
+    <w:semiHidden/>
+    <w:rsid w:val="00B23C3A"/>
+    <w:rPr>
+      <w:rFonts w:asciiTheme="majorHAnsi" w:eastAsiaTheme="majorEastAsia" w:hAnsiTheme="majorHAnsi" w:cstheme="majorBidi"/>
+      <w:i/>
+      <w:iCs/>
+      <w:color w:val="2F5496" w:themeColor="accent1" w:themeShade="BF"/>
     </w:rPr>
   </w:style>
 </w:styles>

</xml_diff>

<commit_message>
Parte de Cedrick act2 Unidad 2 no tiene compu o forma de usar github
</commit_message>
<xml_diff>
--- a/Actividad 2 Unidad 2 usuarioCOmputadora/Actividad 2 de Usuario COmputadora Unidad 2.docx
+++ b/Actividad 2 Unidad 2 usuarioCOmputadora/Actividad 2 de Usuario COmputadora Unidad 2.docx
@@ -1,6 +1,6 @@
 
 <file path=word/document.xml><?xml version="1.0" encoding="utf-8"?>
-<w:document xmlns:wpc="http://schemas.microsoft.com/office/word/2010/wordprocessingCanvas" xmlns:cx="http://schemas.microsoft.com/office/drawing/2014/chartex" xmlns:cx1="http://schemas.microsoft.com/office/drawing/2015/9/8/chartex" xmlns:cx2="http://schemas.microsoft.com/office/drawing/2015/10/21/chartex" xmlns:cx3="http://schemas.microsoft.com/office/drawing/2016/5/9/chartex" xmlns:cx4="http://schemas.microsoft.com/office/drawing/2016/5/10/chartex" xmlns:cx5="http://schemas.microsoft.com/office/drawing/2016/5/11/chartex" xmlns:cx6="http://schemas.microsoft.com/office/drawing/2016/5/12/chartex" xmlns:cx7="http://schemas.microsoft.com/office/drawing/2016/5/13/chartex" xmlns:cx8="http://schemas.microsoft.com/office/drawing/2016/5/14/chartex" xmlns:mc="http://schemas.openxmlformats.org/markup-compatibility/2006" xmlns:aink="http://schemas.microsoft.com/office/drawing/2016/ink" xmlns:am3d="http://schemas.microsoft.com/office/drawing/2017/model3d" xmlns:o="urn:schemas-microsoft-com:office:office" xmlns:r="http://schemas.openxmlformats.org/officeDocument/2006/relationships" xmlns:m="http://schemas.openxmlformats.org/officeDocument/2006/math" xmlns:v="urn:schemas-microsoft-com:vml" xmlns:wp14="http://schemas.microsoft.com/office/word/2010/wordprocessingDrawing" xmlns:wp="http://schemas.openxmlformats.org/drawingml/2006/wordprocessingDrawing" xmlns:w10="urn:schemas-microsoft-com:office:word" xmlns:w="http://schemas.openxmlformats.org/wordprocessingml/2006/main" xmlns:w14="http://schemas.microsoft.com/office/word/2010/wordml" xmlns:w15="http://schemas.microsoft.com/office/word/2012/wordml" xmlns:w16cex="http://schemas.microsoft.com/office/word/2018/wordml/cex" xmlns:w16cid="http://schemas.microsoft.com/office/word/2016/wordml/cid" xmlns:w16="http://schemas.microsoft.com/office/word/2018/wordml" xmlns:w16se="http://schemas.microsoft.com/office/word/2015/wordml/symex" xmlns:wpg="http://schemas.microsoft.com/office/word/2010/wordprocessingGroup" xmlns:wpi="http://schemas.microsoft.com/office/word/2010/wordprocessingInk" xmlns:wne="http://schemas.microsoft.com/office/word/2006/wordml" xmlns:wps="http://schemas.microsoft.com/office/word/2010/wordprocessingShape" mc:Ignorable="w14 w15 w16se w16cid w16 w16cex wp14">
+<w:document xmlns:wpc="http://schemas.microsoft.com/office/word/2010/wordprocessingCanvas" xmlns:cx="http://schemas.microsoft.com/office/drawing/2014/chartex" xmlns:cx1="http://schemas.microsoft.com/office/drawing/2015/9/8/chartex" xmlns:cx2="http://schemas.microsoft.com/office/drawing/2015/10/21/chartex" xmlns:cx3="http://schemas.microsoft.com/office/drawing/2016/5/9/chartex" xmlns:cx4="http://schemas.microsoft.com/office/drawing/2016/5/10/chartex" xmlns:cx5="http://schemas.microsoft.com/office/drawing/2016/5/11/chartex" xmlns:cx6="http://schemas.microsoft.com/office/drawing/2016/5/12/chartex" xmlns:cx7="http://schemas.microsoft.com/office/drawing/2016/5/13/chartex" xmlns:cx8="http://schemas.microsoft.com/office/drawing/2016/5/14/chartex" xmlns:mc="http://schemas.openxmlformats.org/markup-compatibility/2006" xmlns:aink="http://schemas.microsoft.com/office/drawing/2016/ink" xmlns:am3d="http://schemas.microsoft.com/office/drawing/2017/model3d" xmlns:o="urn:schemas-microsoft-com:office:office" xmlns:oel="http://schemas.microsoft.com/office/2019/extlst" xmlns:r="http://schemas.openxmlformats.org/officeDocument/2006/relationships" xmlns:m="http://schemas.openxmlformats.org/officeDocument/2006/math" xmlns:v="urn:schemas-microsoft-com:vml" xmlns:wp14="http://schemas.microsoft.com/office/word/2010/wordprocessingDrawing" xmlns:wp="http://schemas.openxmlformats.org/drawingml/2006/wordprocessingDrawing" xmlns:w10="urn:schemas-microsoft-com:office:word" xmlns:w="http://schemas.openxmlformats.org/wordprocessingml/2006/main" xmlns:w14="http://schemas.microsoft.com/office/word/2010/wordml" xmlns:w15="http://schemas.microsoft.com/office/word/2012/wordml" xmlns:w16cex="http://schemas.microsoft.com/office/word/2018/wordml/cex" xmlns:w16cid="http://schemas.microsoft.com/office/word/2016/wordml/cid" xmlns:w16="http://schemas.microsoft.com/office/word/2018/wordml" xmlns:w16du="http://schemas.microsoft.com/office/word/2023/wordml/word16du" xmlns:w16sdtdh="http://schemas.microsoft.com/office/word/2020/wordml/sdtdatahash" xmlns:w16se="http://schemas.microsoft.com/office/word/2015/wordml/symex" xmlns:wpg="http://schemas.microsoft.com/office/word/2010/wordprocessingGroup" xmlns:wpi="http://schemas.microsoft.com/office/word/2010/wordprocessingInk" xmlns:wne="http://schemas.microsoft.com/office/word/2006/wordml" xmlns:wps="http://schemas.microsoft.com/office/word/2010/wordprocessingShape" mc:Ignorable="w14 w15 w16se w16cid w16 w16cex w16sdtdh w16du wp14">
   <w:body>
     <w:p>
       <w:pPr>
@@ -1216,31 +1216,7 @@
           <w:lang w:eastAsia="es-MX"/>
           <w14:ligatures w14:val="none"/>
         </w:rPr>
-        <w:t xml:space="preserve"> Evaluar si los usuarios acceden desde teléfonos inteligentes (smartphones), tabletas, computadoras de escritorio o laptops. Cada dispositivo exige consideraciones de diseño diferentes (</w:t>
-      </w:r>
-      <w:proofErr w:type="spellStart"/>
-      <w:r>
-        <w:rPr>
-          <w:rFonts w:ascii="Times New Roman" w:eastAsia="Times New Roman" w:hAnsi="Times New Roman" w:cs="Times New Roman"/>
-          <w:kern w:val="0"/>
-          <w:sz w:val="24"/>
-          <w:szCs w:val="24"/>
-          <w:lang w:eastAsia="es-MX"/>
-          <w14:ligatures w14:val="none"/>
-        </w:rPr>
-        <w:t>responsive</w:t>
-      </w:r>
-      <w:proofErr w:type="spellEnd"/>
-      <w:r>
-        <w:rPr>
-          <w:rFonts w:ascii="Times New Roman" w:eastAsia="Times New Roman" w:hAnsi="Times New Roman" w:cs="Times New Roman"/>
-          <w:kern w:val="0"/>
-          <w:sz w:val="24"/>
-          <w:szCs w:val="24"/>
-          <w:lang w:eastAsia="es-MX"/>
-          <w14:ligatures w14:val="none"/>
-        </w:rPr>
-        <w:t xml:space="preserve"> </w:t>
+        <w:t xml:space="preserve"> Evaluar si los usuarios acceden desde teléfonos inteligentes (smartphones), tabletas, computadoras de escritorio o laptops. Cada dispositivo exige consideraciones de diseño diferentes (responsive </w:t>
       </w:r>
       <w:proofErr w:type="spellStart"/>
       <w:r>
@@ -2358,6 +2334,379 @@
           <w14:ligatures w14:val="none"/>
         </w:rPr>
       </w:pPr>
+    </w:p>
+    <w:p>
+      <w:r>
+        <w:rPr>
+          <w:highlight w:val="yellow"/>
+        </w:rPr>
+        <w:lastRenderedPageBreak/>
+        <w:t xml:space="preserve">Parte de </w:t>
+      </w:r>
+      <w:proofErr w:type="spellStart"/>
+      <w:r>
+        <w:rPr>
+          <w:highlight w:val="yellow"/>
+        </w:rPr>
+        <w:t>Cedrick</w:t>
+      </w:r>
+      <w:proofErr w:type="spellEnd"/>
+      <w:r>
+        <w:rPr>
+          <w:highlight w:val="yellow"/>
+        </w:rPr>
+        <w:t xml:space="preserve"> </w:t>
+      </w:r>
+      <w:proofErr w:type="gramStart"/>
+      <w:r>
+        <w:rPr>
+          <w:highlight w:val="yellow"/>
+        </w:rPr>
+        <w:t>( no</w:t>
+      </w:r>
+      <w:proofErr w:type="gramEnd"/>
+      <w:r>
+        <w:rPr>
+          <w:highlight w:val="yellow"/>
+        </w:rPr>
+        <w:t xml:space="preserve"> tiene computadora o forma de usar </w:t>
+      </w:r>
+      <w:proofErr w:type="spellStart"/>
+      <w:r>
+        <w:rPr>
+          <w:highlight w:val="yellow"/>
+        </w:rPr>
+        <w:t>github</w:t>
+      </w:r>
+      <w:proofErr w:type="spellEnd"/>
+      <w:r>
+        <w:rPr>
+          <w:highlight w:val="yellow"/>
+        </w:rPr>
+        <w:t>)</w:t>
+      </w:r>
+    </w:p>
+    <w:p>
+      <w:pPr>
+        <w:jc w:val="center"/>
+        <w:rPr>
+          <w:rFonts w:ascii="Biome" w:hAnsi="Biome" w:cs="Biome"/>
+        </w:rPr>
+      </w:pPr>
+      <w:r>
+        <w:rPr>
+          <w:rFonts w:ascii="Biome" w:hAnsi="Biome" w:cs="Biome"/>
+          <w:b/>
+          <w:sz w:val="34"/>
+          <w:szCs w:val="34"/>
+        </w:rPr>
+        <w:t>Diagrama del Proceso de Diseño y Ensamblado</w:t>
+      </w:r>
+    </w:p>
+    <w:p>
+      <w:pPr>
+        <w:jc w:val="center"/>
+        <w:rPr>
+          <w:rFonts w:ascii="Biome" w:hAnsi="Biome" w:cs="Biome"/>
+        </w:rPr>
+      </w:pPr>
+      <w:r>
+        <w:rPr>
+          <w:rFonts w:ascii="Biome" w:hAnsi="Biome" w:cs="Biome"/>
+          <w:i/>
+        </w:rPr>
+        <w:t>Aplicación del Diseño Centrado en el Usuario (DCU)</w:t>
+      </w:r>
+    </w:p>
+    <w:p>
+      <w:pPr>
+        <w:pStyle w:val="Ttulo1"/>
+        <w:rPr>
+          <w:rFonts w:ascii="Biome" w:hAnsi="Biome" w:cs="Biome"/>
+        </w:rPr>
+      </w:pPr>
+      <w:r>
+        <w:rPr>
+          <w:rFonts w:ascii="Biome" w:hAnsi="Biome" w:cs="Biome"/>
+        </w:rPr>
+        <w:t>Diagrama del proceso de diseño</w:t>
+      </w:r>
+    </w:p>
+    <w:p>
+      <w:pPr>
+        <w:rPr>
+          <w:rFonts w:ascii="Biome" w:hAnsi="Biome" w:cs="Biome"/>
+          <w:kern w:val="0"/>
+        </w:rPr>
+      </w:pPr>
+      <w:r>
+        <w:rPr>
+          <w:rFonts w:ascii="Biome" w:hAnsi="Biome" w:cs="Biome"/>
+        </w:rPr>
+        <w:t>El siguiente diagrama representa el flujo que seguirá el equipo durante el desarrollo del proyecto, integrando las etapas del Diseño Centrado en el Usuario (DCU): investigación, ideación, diseño, desarrollo y evaluación. El proceso es iterativo, por lo que los resultados de las pruebas pueden llevar al equipo a realizar ajustes en etapas anteriores.</w:t>
+      </w:r>
+    </w:p>
+    <w:p>
+      <w:pPr>
+        <w:jc w:val="center"/>
+        <w:rPr>
+          <w:rFonts w:ascii="Biome" w:hAnsi="Biome" w:cs="Biome"/>
+        </w:rPr>
+      </w:pPr>
+      <w:r>
+        <w:rPr>
+          <w:noProof/>
+        </w:rPr>
+        <w:drawing>
+          <wp:inline distT="0" distB="0" distL="0" distR="0" wp14:anchorId="0FECFBEC" wp14:editId="0B6846F3">
+            <wp:extent cx="5612130" cy="3741420"/>
+            <wp:effectExtent l="0" t="0" r="7620" b="0"/>
+            <wp:docPr id="1192598907" name="Imagen 1"/>
+            <wp:cNvGraphicFramePr>
+              <a:graphicFrameLocks xmlns:a="http://schemas.openxmlformats.org/drawingml/2006/main" noChangeAspect="1"/>
+            </wp:cNvGraphicFramePr>
+            <a:graphic xmlns:a="http://schemas.openxmlformats.org/drawingml/2006/main">
+              <a:graphicData uri="http://schemas.openxmlformats.org/drawingml/2006/picture">
+                <pic:pic xmlns:pic="http://schemas.openxmlformats.org/drawingml/2006/picture">
+                  <pic:nvPicPr>
+                    <pic:cNvPr id="0" name="Picture 1"/>
+                    <pic:cNvPicPr>
+                      <a:picLocks noChangeAspect="1" noChangeArrowheads="1"/>
+                    </pic:cNvPicPr>
+                  </pic:nvPicPr>
+                  <pic:blipFill>
+                    <a:blip r:embed="rId5">
+                      <a:extLst>
+                        <a:ext uri="{28A0092B-C50C-407E-A947-70E740481C1C}">
+                          <a14:useLocalDpi xmlns:a14="http://schemas.microsoft.com/office/drawing/2010/main" val="0"/>
+                        </a:ext>
+                      </a:extLst>
+                    </a:blip>
+                    <a:srcRect/>
+                    <a:stretch>
+                      <a:fillRect/>
+                    </a:stretch>
+                  </pic:blipFill>
+                  <pic:spPr bwMode="auto">
+                    <a:xfrm>
+                      <a:off x="0" y="0"/>
+                      <a:ext cx="5612130" cy="3741420"/>
+                    </a:xfrm>
+                    <a:prstGeom prst="rect">
+                      <a:avLst/>
+                    </a:prstGeom>
+                    <a:noFill/>
+                    <a:ln>
+                      <a:noFill/>
+                    </a:ln>
+                  </pic:spPr>
+                </pic:pic>
+              </a:graphicData>
+            </a:graphic>
+          </wp:inline>
+        </w:drawing>
+      </w:r>
+      <w:r>
+        <w:rPr>
+          <w:rFonts w:ascii="Biome" w:hAnsi="Biome" w:cs="Biome"/>
+        </w:rPr>
+        <w:t xml:space="preserve"> </w:t>
+      </w:r>
+    </w:p>
+    <w:p>
+      <w:pPr>
+        <w:rPr>
+          <w:rFonts w:ascii="Biome" w:hAnsi="Biome" w:cs="Biome"/>
+        </w:rPr>
+      </w:pPr>
+      <w:r>
+        <w:rPr>
+          <w:rFonts w:ascii="Biome" w:hAnsi="Biome" w:cs="Biome"/>
+        </w:rPr>
+        <w:br w:type="page"/>
+      </w:r>
+    </w:p>
+    <w:p>
+      <w:pPr>
+        <w:pStyle w:val="Ttulo1"/>
+        <w:rPr>
+          <w:rFonts w:ascii="Biome" w:hAnsi="Biome" w:cs="Biome"/>
+        </w:rPr>
+      </w:pPr>
+      <w:r>
+        <w:rPr>
+          <w:rFonts w:ascii="Biome" w:hAnsi="Biome" w:cs="Biome"/>
+        </w:rPr>
+        <w:lastRenderedPageBreak/>
+        <w:t>Integración del documento final</w:t>
+      </w:r>
+    </w:p>
+    <w:p>
+      <w:pPr>
+        <w:rPr>
+          <w:rFonts w:ascii="Biome" w:hAnsi="Biome" w:cs="Biome"/>
+          <w:kern w:val="0"/>
+        </w:rPr>
+      </w:pPr>
+      <w:r>
+        <w:rPr>
+          <w:rFonts w:ascii="Biome" w:hAnsi="Biome" w:cs="Biome"/>
+        </w:rPr>
+        <w:t>Para preparar una entrega conjunta y coherente, cada integrante deberá entregar su sección terminada. Después, el equipo reunirá todas las partes y realizará las siguientes acciones:</w:t>
+      </w:r>
+    </w:p>
+    <w:p>
+      <w:pPr>
+        <w:pStyle w:val="Listaconnmeros"/>
+        <w:numPr>
+          <w:ilvl w:val="0"/>
+          <w:numId w:val="8"/>
+        </w:numPr>
+        <w:tabs>
+          <w:tab w:val="left" w:pos="360"/>
+        </w:tabs>
+        <w:rPr>
+          <w:rFonts w:ascii="Biome" w:hAnsi="Biome" w:cs="Biome"/>
+        </w:rPr>
+      </w:pPr>
+      <w:r>
+        <w:rPr>
+          <w:rFonts w:ascii="Biome" w:hAnsi="Biome" w:cs="Biome"/>
+          <w:b/>
+        </w:rPr>
+        <w:t xml:space="preserve">Reunión de información. </w:t>
+      </w:r>
+      <w:r>
+        <w:rPr>
+          <w:rFonts w:ascii="Biome" w:hAnsi="Biome" w:cs="Biome"/>
+        </w:rPr>
+        <w:t>Recopilar las secciones de todos los integrantes y comprobar que estén completas.</w:t>
+      </w:r>
+    </w:p>
+    <w:p>
+      <w:pPr>
+        <w:pStyle w:val="Listaconnmeros"/>
+        <w:numPr>
+          <w:ilvl w:val="0"/>
+          <w:numId w:val="8"/>
+        </w:numPr>
+        <w:tabs>
+          <w:tab w:val="left" w:pos="360"/>
+        </w:tabs>
+        <w:rPr>
+          <w:rFonts w:ascii="Biome" w:hAnsi="Biome" w:cs="Biome"/>
+        </w:rPr>
+      </w:pPr>
+      <w:r>
+        <w:rPr>
+          <w:rFonts w:ascii="Biome" w:hAnsi="Biome" w:cs="Biome"/>
+          <w:b/>
+        </w:rPr>
+        <w:t xml:space="preserve">Revisión y organización. </w:t>
+      </w:r>
+      <w:r>
+        <w:rPr>
+          <w:rFonts w:ascii="Biome" w:hAnsi="Biome" w:cs="Biome"/>
+        </w:rPr>
+        <w:t>Ordenar los apartados según las indicaciones del trabajo y verificar que las ideas tengan continuidad.</w:t>
+      </w:r>
+    </w:p>
+    <w:p>
+      <w:pPr>
+        <w:pStyle w:val="Listaconnmeros"/>
+        <w:numPr>
+          <w:ilvl w:val="0"/>
+          <w:numId w:val="8"/>
+        </w:numPr>
+        <w:tabs>
+          <w:tab w:val="left" w:pos="360"/>
+        </w:tabs>
+        <w:rPr>
+          <w:rFonts w:ascii="Biome" w:hAnsi="Biome" w:cs="Biome"/>
+        </w:rPr>
+      </w:pPr>
+      <w:r>
+        <w:rPr>
+          <w:rFonts w:ascii="Biome" w:hAnsi="Biome" w:cs="Biome"/>
+          <w:b/>
+        </w:rPr>
+        <w:t xml:space="preserve">Unificación del formato. </w:t>
+      </w:r>
+      <w:r>
+        <w:rPr>
+          <w:rFonts w:ascii="Biome" w:hAnsi="Biome" w:cs="Biome"/>
+        </w:rPr>
+        <w:t>Ajustar títulos, subtítulos, tipografía, espaciado, numeración e imágenes para mantener una presentación uniforme.</w:t>
+      </w:r>
+    </w:p>
+    <w:p>
+      <w:pPr>
+        <w:pStyle w:val="Listaconnmeros"/>
+        <w:numPr>
+          <w:ilvl w:val="0"/>
+          <w:numId w:val="8"/>
+        </w:numPr>
+        <w:tabs>
+          <w:tab w:val="left" w:pos="360"/>
+        </w:tabs>
+        <w:rPr>
+          <w:rFonts w:ascii="Biome" w:hAnsi="Biome" w:cs="Biome"/>
+        </w:rPr>
+      </w:pPr>
+      <w:r>
+        <w:rPr>
+          <w:rFonts w:ascii="Biome" w:hAnsi="Biome" w:cs="Biome"/>
+          <w:b/>
+        </w:rPr>
+        <w:t xml:space="preserve">Edición final. </w:t>
+      </w:r>
+      <w:r>
+        <w:rPr>
+          <w:rFonts w:ascii="Biome" w:hAnsi="Biome" w:cs="Biome"/>
+        </w:rPr>
+        <w:t>Corregir ortografía, redacción, repeticiones y detalles de formato.</w:t>
+      </w:r>
+    </w:p>
+    <w:p>
+      <w:pPr>
+        <w:pStyle w:val="Listaconnmeros"/>
+        <w:numPr>
+          <w:ilvl w:val="0"/>
+          <w:numId w:val="8"/>
+        </w:numPr>
+        <w:tabs>
+          <w:tab w:val="left" w:pos="360"/>
+        </w:tabs>
+        <w:rPr>
+          <w:rFonts w:ascii="Biome" w:hAnsi="Biome" w:cs="Biome"/>
+        </w:rPr>
+      </w:pPr>
+      <w:r>
+        <w:rPr>
+          <w:rFonts w:ascii="Biome" w:hAnsi="Biome" w:cs="Biome"/>
+          <w:b/>
+        </w:rPr>
+        <w:t xml:space="preserve">Entrega del proyecto. </w:t>
+      </w:r>
+      <w:r>
+        <w:rPr>
+          <w:rFonts w:ascii="Biome" w:hAnsi="Biome" w:cs="Biome"/>
+        </w:rPr>
+        <w:t>Guardar el documento final en el formato solicitado y comprobar que esté listo para su presentación.</w:t>
+      </w:r>
+    </w:p>
+    <w:p>
+      <w:pPr>
+        <w:rPr>
+          <w:rFonts w:ascii="Biome" w:hAnsi="Biome" w:cs="Biome"/>
+        </w:rPr>
+      </w:pPr>
+      <w:r>
+        <w:rPr>
+          <w:rFonts w:ascii="Biome" w:hAnsi="Biome" w:cs="Biome"/>
+        </w:rPr>
+        <w:t>Nota: este archivo contiene la sección correspondiente al Integrante 4. Para ensamblar el documento completo del equipo, todavía es necesario incorporar los archivos de los demás integrantes.</w:t>
+      </w:r>
     </w:p>
     <w:p/>
     <w:sectPr>
@@ -2371,7 +2720,7 @@
 </file>
 
 <file path=word/numbering.xml><?xml version="1.0" encoding="utf-8"?>
-<w:numbering xmlns:wpc="http://schemas.microsoft.com/office/word/2010/wordprocessingCanvas" xmlns:cx="http://schemas.microsoft.com/office/drawing/2014/chartex" xmlns:cx1="http://schemas.microsoft.com/office/drawing/2015/9/8/chartex" xmlns:cx2="http://schemas.microsoft.com/office/drawing/2015/10/21/chartex" xmlns:cx3="http://schemas.microsoft.com/office/drawing/2016/5/9/chartex" xmlns:cx4="http://schemas.microsoft.com/office/drawing/2016/5/10/chartex" xmlns:cx5="http://schemas.microsoft.com/office/drawing/2016/5/11/chartex" xmlns:cx6="http://schemas.microsoft.com/office/drawing/2016/5/12/chartex" xmlns:cx7="http://schemas.microsoft.com/office/drawing/2016/5/13/chartex" xmlns:cx8="http://schemas.microsoft.com/office/drawing/2016/5/14/chartex" xmlns:mc="http://schemas.openxmlformats.org/markup-compatibility/2006" xmlns:aink="http://schemas.microsoft.com/office/drawing/2016/ink" xmlns:am3d="http://schemas.microsoft.com/office/drawing/2017/model3d" xmlns:o="urn:schemas-microsoft-com:office:office" xmlns:r="http://schemas.openxmlformats.org/officeDocument/2006/relationships" xmlns:m="http://schemas.openxmlformats.org/officeDocument/2006/math" xmlns:v="urn:schemas-microsoft-com:vml" xmlns:wp14="http://schemas.microsoft.com/office/word/2010/wordprocessingDrawing" xmlns:wp="http://schemas.openxmlformats.org/drawingml/2006/wordprocessingDrawing" xmlns:w10="urn:schemas-microsoft-com:office:word" xmlns:w="http://schemas.openxmlformats.org/wordprocessingml/2006/main" xmlns:w14="http://schemas.microsoft.com/office/word/2010/wordml" xmlns:w15="http://schemas.microsoft.com/office/word/2012/wordml" xmlns:w16cex="http://schemas.microsoft.com/office/word/2018/wordml/cex" xmlns:w16cid="http://schemas.microsoft.com/office/word/2016/wordml/cid" xmlns:w16="http://schemas.microsoft.com/office/word/2018/wordml" xmlns:w16se="http://schemas.microsoft.com/office/word/2015/wordml/symex" xmlns:wpg="http://schemas.microsoft.com/office/word/2010/wordprocessingGroup" xmlns:wpi="http://schemas.microsoft.com/office/word/2010/wordprocessingInk" xmlns:wne="http://schemas.microsoft.com/office/word/2006/wordml" xmlns:wps="http://schemas.microsoft.com/office/word/2010/wordprocessingShape" mc:Ignorable="w14 w15 w16se w16cid w16 w16cex wp14">
+<w:numbering xmlns:wpc="http://schemas.microsoft.com/office/word/2010/wordprocessingCanvas" xmlns:cx="http://schemas.microsoft.com/office/drawing/2014/chartex" xmlns:cx1="http://schemas.microsoft.com/office/drawing/2015/9/8/chartex" xmlns:cx2="http://schemas.microsoft.com/office/drawing/2015/10/21/chartex" xmlns:cx3="http://schemas.microsoft.com/office/drawing/2016/5/9/chartex" xmlns:cx4="http://schemas.microsoft.com/office/drawing/2016/5/10/chartex" xmlns:cx5="http://schemas.microsoft.com/office/drawing/2016/5/11/chartex" xmlns:cx6="http://schemas.microsoft.com/office/drawing/2016/5/12/chartex" xmlns:cx7="http://schemas.microsoft.com/office/drawing/2016/5/13/chartex" xmlns:cx8="http://schemas.microsoft.com/office/drawing/2016/5/14/chartex" xmlns:mc="http://schemas.openxmlformats.org/markup-compatibility/2006" xmlns:aink="http://schemas.microsoft.com/office/drawing/2016/ink" xmlns:am3d="http://schemas.microsoft.com/office/drawing/2017/model3d" xmlns:o="urn:schemas-microsoft-com:office:office" xmlns:oel="http://schemas.microsoft.com/office/2019/extlst" xmlns:r="http://schemas.openxmlformats.org/officeDocument/2006/relationships" xmlns:m="http://schemas.openxmlformats.org/officeDocument/2006/math" xmlns:v="urn:schemas-microsoft-com:vml" xmlns:wp14="http://schemas.microsoft.com/office/word/2010/wordprocessingDrawing" xmlns:wp="http://schemas.openxmlformats.org/drawingml/2006/wordprocessingDrawing" xmlns:w10="urn:schemas-microsoft-com:office:word" xmlns:w="http://schemas.openxmlformats.org/wordprocessingml/2006/main" xmlns:w14="http://schemas.microsoft.com/office/word/2010/wordml" xmlns:w15="http://schemas.microsoft.com/office/word/2012/wordml" xmlns:w16cex="http://schemas.microsoft.com/office/word/2018/wordml/cex" xmlns:w16cid="http://schemas.microsoft.com/office/word/2016/wordml/cid" xmlns:w16="http://schemas.microsoft.com/office/word/2018/wordml" xmlns:w16du="http://schemas.microsoft.com/office/word/2023/wordml/word16du" xmlns:w16sdtdh="http://schemas.microsoft.com/office/word/2020/wordml/sdtdatahash" xmlns:w16se="http://schemas.microsoft.com/office/word/2015/wordml/symex" xmlns:wpg="http://schemas.microsoft.com/office/word/2010/wordprocessingGroup" xmlns:wpi="http://schemas.microsoft.com/office/word/2010/wordprocessingInk" xmlns:wne="http://schemas.microsoft.com/office/word/2006/wordml" xmlns:wps="http://schemas.microsoft.com/office/word/2010/wordprocessingShape" mc:Ignorable="w14 w15 w16se w16cid w16 w16cex w16sdtdh w16du wp14">
   <w:abstractNum w:abstractNumId="0" w15:restartNumberingAfterBreak="0">
     <w:nsid w:val="148D2307"/>
     <w:multiLevelType w:val="multilevel"/>
@@ -3207,6 +3556,122 @@
     </w:lvl>
   </w:abstractNum>
   <w:abstractNum w:abstractNumId="6" w15:restartNumberingAfterBreak="0">
+    <w:nsid w:val="5FA87C30"/>
+    <w:multiLevelType w:val="multilevel"/>
+    <w:tmpl w:val="2BC809D2"/>
+    <w:lvl w:ilvl="0">
+      <w:start w:val="1"/>
+      <w:numFmt w:val="decimal"/>
+      <w:lvlText w:val="%1."/>
+      <w:lvlJc w:val="left"/>
+      <w:pPr>
+        <w:tabs>
+          <w:tab w:val="num" w:pos="360"/>
+        </w:tabs>
+        <w:ind w:left="360" w:hanging="360"/>
+      </w:pPr>
+      <w:rPr>
+        <w:rFonts w:ascii="Times New Roman" w:hAnsi="Times New Roman" w:cs="Times New Roman" w:hint="default"/>
+      </w:rPr>
+    </w:lvl>
+    <w:lvl w:ilvl="1">
+      <w:start w:val="1"/>
+      <w:numFmt w:val="decimal"/>
+      <w:lvlText w:val="%2."/>
+      <w:lvlJc w:val="left"/>
+      <w:pPr>
+        <w:tabs>
+          <w:tab w:val="num" w:pos="1440"/>
+        </w:tabs>
+        <w:ind w:left="1440" w:hanging="360"/>
+      </w:pPr>
+    </w:lvl>
+    <w:lvl w:ilvl="2">
+      <w:start w:val="1"/>
+      <w:numFmt w:val="decimal"/>
+      <w:lvlText w:val="%3."/>
+      <w:lvlJc w:val="left"/>
+      <w:pPr>
+        <w:tabs>
+          <w:tab w:val="num" w:pos="2160"/>
+        </w:tabs>
+        <w:ind w:left="2160" w:hanging="360"/>
+      </w:pPr>
+    </w:lvl>
+    <w:lvl w:ilvl="3">
+      <w:start w:val="1"/>
+      <w:numFmt w:val="decimal"/>
+      <w:lvlText w:val="%4."/>
+      <w:lvlJc w:val="left"/>
+      <w:pPr>
+        <w:tabs>
+          <w:tab w:val="num" w:pos="2880"/>
+        </w:tabs>
+        <w:ind w:left="2880" w:hanging="360"/>
+      </w:pPr>
+    </w:lvl>
+    <w:lvl w:ilvl="4">
+      <w:start w:val="1"/>
+      <w:numFmt w:val="decimal"/>
+      <w:lvlText w:val="%5."/>
+      <w:lvlJc w:val="left"/>
+      <w:pPr>
+        <w:tabs>
+          <w:tab w:val="num" w:pos="3600"/>
+        </w:tabs>
+        <w:ind w:left="3600" w:hanging="360"/>
+      </w:pPr>
+    </w:lvl>
+    <w:lvl w:ilvl="5">
+      <w:start w:val="1"/>
+      <w:numFmt w:val="decimal"/>
+      <w:lvlText w:val="%6."/>
+      <w:lvlJc w:val="left"/>
+      <w:pPr>
+        <w:tabs>
+          <w:tab w:val="num" w:pos="4320"/>
+        </w:tabs>
+        <w:ind w:left="4320" w:hanging="360"/>
+      </w:pPr>
+    </w:lvl>
+    <w:lvl w:ilvl="6">
+      <w:start w:val="1"/>
+      <w:numFmt w:val="decimal"/>
+      <w:lvlText w:val="%7."/>
+      <w:lvlJc w:val="left"/>
+      <w:pPr>
+        <w:tabs>
+          <w:tab w:val="num" w:pos="5040"/>
+        </w:tabs>
+        <w:ind w:left="5040" w:hanging="360"/>
+      </w:pPr>
+    </w:lvl>
+    <w:lvl w:ilvl="7">
+      <w:start w:val="1"/>
+      <w:numFmt w:val="decimal"/>
+      <w:lvlText w:val="%8."/>
+      <w:lvlJc w:val="left"/>
+      <w:pPr>
+        <w:tabs>
+          <w:tab w:val="num" w:pos="5760"/>
+        </w:tabs>
+        <w:ind w:left="5760" w:hanging="360"/>
+      </w:pPr>
+    </w:lvl>
+    <w:lvl w:ilvl="8">
+      <w:start w:val="1"/>
+      <w:numFmt w:val="decimal"/>
+      <w:lvlText w:val="%9."/>
+      <w:lvlJc w:val="left"/>
+      <w:pPr>
+        <w:tabs>
+          <w:tab w:val="num" w:pos="6480"/>
+        </w:tabs>
+        <w:ind w:left="6480" w:hanging="360"/>
+      </w:pPr>
+    </w:lvl>
+  </w:abstractNum>
+  <w:abstractNum w:abstractNumId="7" w15:restartNumberingAfterBreak="0">
     <w:nsid w:val="735E387F"/>
     <w:multiLevelType w:val="multilevel"/>
     <w:tmpl w:val="3FE48CE4"/>
@@ -3351,32 +3816,62 @@
       </w:rPr>
     </w:lvl>
   </w:abstractNum>
-  <w:num w:numId="1">
+  <w:num w:numId="1" w16cid:durableId="1303121626">
     <w:abstractNumId w:val="0"/>
   </w:num>
-  <w:num w:numId="2">
+  <w:num w:numId="2" w16cid:durableId="1217742220">
     <w:abstractNumId w:val="4"/>
   </w:num>
-  <w:num w:numId="3">
+  <w:num w:numId="3" w16cid:durableId="1141850897">
     <w:abstractNumId w:val="3"/>
   </w:num>
-  <w:num w:numId="4">
+  <w:num w:numId="4" w16cid:durableId="113377522">
     <w:abstractNumId w:val="5"/>
   </w:num>
-  <w:num w:numId="5">
+  <w:num w:numId="5" w16cid:durableId="248317072">
     <w:abstractNumId w:val="1"/>
   </w:num>
-  <w:num w:numId="6">
+  <w:num w:numId="6" w16cid:durableId="796797300">
+    <w:abstractNumId w:val="7"/>
+  </w:num>
+  <w:num w:numId="7" w16cid:durableId="911159306">
+    <w:abstractNumId w:val="2"/>
+  </w:num>
+  <w:num w:numId="8" w16cid:durableId="1824999938">
     <w:abstractNumId w:val="6"/>
-  </w:num>
-  <w:num w:numId="7">
-    <w:abstractNumId w:val="2"/>
+    <w:lvlOverride w:ilvl="0">
+      <w:startOverride w:val="1"/>
+    </w:lvlOverride>
+    <w:lvlOverride w:ilvl="1">
+      <w:startOverride w:val="1"/>
+    </w:lvlOverride>
+    <w:lvlOverride w:ilvl="2">
+      <w:startOverride w:val="1"/>
+    </w:lvlOverride>
+    <w:lvlOverride w:ilvl="3">
+      <w:startOverride w:val="1"/>
+    </w:lvlOverride>
+    <w:lvlOverride w:ilvl="4">
+      <w:startOverride w:val="1"/>
+    </w:lvlOverride>
+    <w:lvlOverride w:ilvl="5">
+      <w:startOverride w:val="1"/>
+    </w:lvlOverride>
+    <w:lvlOverride w:ilvl="6">
+      <w:startOverride w:val="1"/>
+    </w:lvlOverride>
+    <w:lvlOverride w:ilvl="7">
+      <w:startOverride w:val="1"/>
+    </w:lvlOverride>
+    <w:lvlOverride w:ilvl="8">
+      <w:startOverride w:val="1"/>
+    </w:lvlOverride>
   </w:num>
 </w:numbering>
 </file>
 
 <file path=word/styles.xml><?xml version="1.0" encoding="utf-8"?>
-<w:styles xmlns:mc="http://schemas.openxmlformats.org/markup-compatibility/2006" xmlns:r="http://schemas.openxmlformats.org/officeDocument/2006/relationships" xmlns:w="http://schemas.openxmlformats.org/wordprocessingml/2006/main" xmlns:w14="http://schemas.microsoft.com/office/word/2010/wordml" xmlns:w15="http://schemas.microsoft.com/office/word/2012/wordml" xmlns:w16cex="http://schemas.microsoft.com/office/word/2018/wordml/cex" xmlns:w16cid="http://schemas.microsoft.com/office/word/2016/wordml/cid" xmlns:w16="http://schemas.microsoft.com/office/word/2018/wordml" xmlns:w16se="http://schemas.microsoft.com/office/word/2015/wordml/symex" mc:Ignorable="w14 w15 w16se w16cid w16 w16cex">
+<w:styles xmlns:mc="http://schemas.openxmlformats.org/markup-compatibility/2006" xmlns:r="http://schemas.openxmlformats.org/officeDocument/2006/relationships" xmlns:w="http://schemas.openxmlformats.org/wordprocessingml/2006/main" xmlns:w14="http://schemas.microsoft.com/office/word/2010/wordml" xmlns:w15="http://schemas.microsoft.com/office/word/2012/wordml" xmlns:w16cex="http://schemas.microsoft.com/office/word/2018/wordml/cex" xmlns:w16cid="http://schemas.microsoft.com/office/word/2016/wordml/cid" xmlns:w16="http://schemas.microsoft.com/office/word/2018/wordml" xmlns:w16du="http://schemas.microsoft.com/office/word/2023/wordml/word16du" xmlns:w16sdtdh="http://schemas.microsoft.com/office/word/2020/wordml/sdtdatahash" xmlns:w16se="http://schemas.microsoft.com/office/word/2015/wordml/symex" mc:Ignorable="w14 w15 w16se w16cid w16 w16cex w16sdtdh w16du">
   <w:docDefaults>
     <w:rPrDefault>
       <w:rPr>
@@ -3992,6 +4487,28 @@
       <w:lang w:val="es-US" w:eastAsia="es-MX"/>
     </w:rPr>
   </w:style>
+  <w:style w:type="paragraph" w:styleId="Listaconnmeros">
+    <w:name w:val="List Number"/>
+    <w:basedOn w:val="Normal"/>
+    <w:uiPriority w:val="99"/>
+    <w:semiHidden/>
+    <w:unhideWhenUsed/>
+    <w:rsid w:val="002116EE"/>
+    <w:pPr>
+      <w:tabs>
+        <w:tab w:val="left" w:pos="360"/>
+      </w:tabs>
+      <w:spacing w:before="100" w:beforeAutospacing="1" w:after="200" w:line="273" w:lineRule="auto"/>
+      <w:ind w:left="360" w:hanging="360"/>
+      <w:contextualSpacing/>
+    </w:pPr>
+    <w:rPr>
+      <w:rFonts w:ascii="Arial" w:eastAsia="MS Mincho" w:hAnsi="Arial" w:cs="Times New Roman"/>
+      <w:kern w:val="0"/>
+      <w:lang w:eastAsia="es-MX"/>
+      <w14:ligatures w14:val="none"/>
+    </w:rPr>
+  </w:style>
 </w:styles>
 </file>
 

</xml_diff>